<commit_message>
chore: 작업 자동 저장 (2026-08-19 17:24)
</commit_message>
<xml_diff>
--- a/docs/government-project/09_산출물목록.docx
+++ b/docs/government-project/09_산출물목록.docx
@@ -1328,6 +1328,204 @@
           </w:p>
         </w:tc>
       </w:tr>
+      <w:tr>
+        <w:tc>
+          <w:tcPr>
+            <w:tcW w:type="dxa" w:w="400"/>
+            <w:tcBorders>
+              <w:top w:val="single" w:color="CCCCCC" w:sz="1"/>
+              <w:left w:val="single" w:color="CCCCCC" w:sz="1"/>
+              <w:bottom w:val="single" w:color="CCCCCC" w:sz="1"/>
+              <w:right w:val="single" w:color="CCCCCC" w:sz="1"/>
+            </w:tcBorders>
+            <w:shd w:fill="FFFFFF" w:val="clear"/>
+            <w:tcMar>
+              <w:top w:type="dxa" w:w="80"/>
+              <w:left w:type="dxa" w:w="120"/>
+              <w:bottom w:type="dxa" w:w="80"/>
+              <w:right w:type="dxa" w:w="120"/>
+            </w:tcMar>
+          </w:tcPr>
+          <w:p>
+            <w:pPr>
+              <w:jc w:val="left"/>
+            </w:pPr>
+            <w:r>
+              <w:rPr>
+                <w:rFonts w:ascii="맑은 고딕" w:cs="맑은 고딕" w:eastAsia="맑은 고딕" w:hAnsi="맑은 고딕"/>
+                <w:b w:val="false"/>
+                <w:bCs w:val="false"/>
+                <w:sz w:val="18"/>
+                <w:szCs w:val="18"/>
+              </w:rPr>
+              <w:t>A-05</w:t>
+            </w:r>
+          </w:p>
+        </w:tc>
+        <w:tc>
+          <w:tcPr>
+            <w:tcW w:type="dxa" w:w="2200"/>
+            <w:tcBorders>
+              <w:top w:val="single" w:color="CCCCCC" w:sz="1"/>
+              <w:left w:val="single" w:color="CCCCCC" w:sz="1"/>
+              <w:bottom w:val="single" w:color="CCCCCC" w:sz="1"/>
+              <w:right w:val="single" w:color="CCCCCC" w:sz="1"/>
+            </w:tcBorders>
+            <w:shd w:fill="FFFFFF" w:val="clear"/>
+            <w:tcMar>
+              <w:top w:type="dxa" w:w="80"/>
+              <w:left w:type="dxa" w:w="120"/>
+              <w:bottom w:type="dxa" w:w="80"/>
+              <w:right w:type="dxa" w:w="120"/>
+            </w:tcMar>
+          </w:tcPr>
+          <w:p>
+            <w:pPr>
+              <w:jc w:val="left"/>
+            </w:pPr>
+            <w:r>
+              <w:rPr>
+                <w:rFonts w:ascii="맑은 고딕" w:cs="맑은 고딕" w:eastAsia="맑은 고딕" w:hAnsi="맑은 고딕"/>
+                <w:b w:val="false"/>
+                <w:bCs w:val="false"/>
+                <w:sz w:val="18"/>
+                <w:szCs w:val="18"/>
+              </w:rPr>
+              <w:t>01-1_화면설계서.docx</w:t>
+            </w:r>
+          </w:p>
+        </w:tc>
+        <w:tc>
+          <w:tcPr>
+            <w:tcW w:type="dxa" w:w="1200"/>
+            <w:tcBorders>
+              <w:top w:val="single" w:color="CCCCCC" w:sz="1"/>
+              <w:left w:val="single" w:color="CCCCCC" w:sz="1"/>
+              <w:bottom w:val="single" w:color="CCCCCC" w:sz="1"/>
+              <w:right w:val="single" w:color="CCCCCC" w:sz="1"/>
+            </w:tcBorders>
+            <w:shd w:fill="FFFFFF" w:val="clear"/>
+            <w:tcMar>
+              <w:top w:type="dxa" w:w="80"/>
+              <w:left w:type="dxa" w:w="120"/>
+              <w:bottom w:type="dxa" w:w="80"/>
+              <w:right w:type="dxa" w:w="120"/>
+            </w:tcMar>
+          </w:tcPr>
+          <w:p>
+            <w:pPr>
+              <w:jc w:val="center"/>
+            </w:pPr>
+            <w:r>
+              <w:rPr>
+                <w:rFonts w:ascii="맑은 고딕" w:cs="맑은 고딕" w:eastAsia="맑은 고딕" w:hAnsi="맑은 고딕"/>
+                <w:b w:val="false"/>
+                <w:bCs w:val="false"/>
+                <w:sz w:val="18"/>
+                <w:szCs w:val="18"/>
+              </w:rPr>
+              <w:t>2026-08-19</w:t>
+            </w:r>
+          </w:p>
+        </w:tc>
+        <w:tc>
+          <w:tcPr>
+            <w:tcW w:type="dxa" w:w="1200"/>
+            <w:tcBorders>
+              <w:top w:val="single" w:color="CCCCCC" w:sz="1"/>
+              <w:left w:val="single" w:color="CCCCCC" w:sz="1"/>
+              <w:bottom w:val="single" w:color="CCCCCC" w:sz="1"/>
+              <w:right w:val="single" w:color="CCCCCC" w:sz="1"/>
+            </w:tcBorders>
+            <w:shd w:fill="FFFFFF" w:val="clear"/>
+            <w:tcMar>
+              <w:top w:type="dxa" w:w="80"/>
+              <w:left w:type="dxa" w:w="120"/>
+              <w:bottom w:type="dxa" w:w="80"/>
+              <w:right w:type="dxa" w:w="120"/>
+            </w:tcMar>
+          </w:tcPr>
+          <w:p>
+            <w:pPr>
+              <w:jc w:val="center"/>
+            </w:pPr>
+            <w:r>
+              <w:rPr>
+                <w:rFonts w:ascii="맑은 고딕" w:cs="맑은 고딕" w:eastAsia="맑은 고딕" w:hAnsi="맑은 고딕"/>
+                <w:b w:val="false"/>
+                <w:bCs w:val="false"/>
+                <w:sz w:val="18"/>
+                <w:szCs w:val="18"/>
+              </w:rPr>
+              <w:t>본로이 PM</w:t>
+            </w:r>
+          </w:p>
+        </w:tc>
+        <w:tc>
+          <w:tcPr>
+            <w:tcW w:type="dxa" w:w="1000"/>
+            <w:tcBorders>
+              <w:top w:val="single" w:color="CCCCCC" w:sz="1"/>
+              <w:left w:val="single" w:color="CCCCCC" w:sz="1"/>
+              <w:bottom w:val="single" w:color="CCCCCC" w:sz="1"/>
+              <w:right w:val="single" w:color="CCCCCC" w:sz="1"/>
+            </w:tcBorders>
+            <w:shd w:fill="E8F5E9" w:val="clear"/>
+            <w:tcMar>
+              <w:top w:type="dxa" w:w="80"/>
+              <w:left w:type="dxa" w:w="120"/>
+              <w:bottom w:type="dxa" w:w="80"/>
+              <w:right w:type="dxa" w:w="120"/>
+            </w:tcMar>
+          </w:tcPr>
+          <w:p>
+            <w:pPr>
+              <w:jc w:val="center"/>
+            </w:pPr>
+            <w:r>
+              <w:rPr>
+                <w:rFonts w:ascii="맑은 고딕" w:cs="맑은 고딕" w:eastAsia="맑은 고딕" w:hAnsi="맑은 고딕"/>
+                <w:sz w:val="18"/>
+                <w:szCs w:val="18"/>
+              </w:rPr>
+              <w:t>작성 완료</w:t>
+            </w:r>
+          </w:p>
+        </w:tc>
+        <w:tc>
+          <w:tcPr>
+            <w:tcW w:type="dxa" w:w="2506"/>
+            <w:tcBorders>
+              <w:top w:val="single" w:color="CCCCCC" w:sz="1"/>
+              <w:left w:val="single" w:color="CCCCCC" w:sz="1"/>
+              <w:bottom w:val="single" w:color="CCCCCC" w:sz="1"/>
+              <w:right w:val="single" w:color="CCCCCC" w:sz="1"/>
+            </w:tcBorders>
+            <w:shd w:fill="FFFFFF" w:val="clear"/>
+            <w:tcMar>
+              <w:top w:type="dxa" w:w="80"/>
+              <w:left w:type="dxa" w:w="120"/>
+              <w:bottom w:type="dxa" w:w="80"/>
+              <w:right w:type="dxa" w:w="120"/>
+            </w:tcMar>
+          </w:tcPr>
+          <w:p>
+            <w:pPr>
+              <w:jc w:val="left"/>
+            </w:pPr>
+            <w:r>
+              <w:rPr>
+                <w:rFonts w:ascii="맑은 고딕" w:cs="맑은 고딕" w:eastAsia="맑은 고딕" w:hAnsi="맑은 고딕"/>
+                <w:b w:val="false"/>
+                <w:bCs w:val="false"/>
+                <w:sz w:val="18"/>
+                <w:szCs w:val="18"/>
+              </w:rPr>
+              <w:t>lo-fi 와이어프레임 10종(P-01~P-10) + 화면별 목적·구성요소·데이터·연결 (~23p)</w:t>
+            </w:r>
+          </w:p>
+        </w:tc>
+      </w:tr>
     </w:tbl>
     <w:p>
       <w:r>
@@ -5345,7 +5543,7 @@
                 <w:sz w:val="18"/>
                 <w:szCs w:val="18"/>
               </w:rPr>
-              <w:t xml:space="preserve">4건</w:t>
+              <w:t>5건</w:t>
             </w:r>
           </w:p>
         </w:tc>
@@ -5378,7 +5576,7 @@
                 <w:sz w:val="18"/>
                 <w:szCs w:val="18"/>
               </w:rPr>
-              <w:t xml:space="preserve">4건 (100%)</w:t>
+              <w:t>5건 (100%)</w:t>
             </w:r>
           </w:p>
         </w:tc>

</xml_diff>

<commit_message>
03_착수보고서 폐기 (PO 결정 2026-08-20)
KHIDI 가 요구한 적 없는 문서인데 이전 세션이 만들어 산출물 목록에 넣어뒀다.
PO 판단: 「그건 그냥 날려버리자. 이전 세션에서 괜히 만든거 같네」.

지운 것
  · docs/government-project/03_착수보고서.docx
  · make_03.cjs · docx_work/make_03.cjs (그 문서 전용 생성기)
  · update_reports.py 의 03 관련 블록 2개
  · 00_INDEX.md 의 03 줄 2개
  · 09_산출물목록의 목록 줄과 제출 일정표 줄, 남은 번호를 B-01 부터 재정렬

⚠️ 실제 착수보고회는 2026-04-16 에 열렸고 발표자료·스크립트·예상질의응답은
PO PC 과제 폴더에 따로 있다. 이번에 지운 것은 그 실물이 아니라, 그것과 별개로
만들어진 우리 쪽 요약 문서다. 기록이 사라지는 게 아니다.

한 번에 못 지운 함정
  drop_row 를 번호(B-01)로 짜서 처음엔 04_중간보고서 줄까지 지워졌다.
  03 줄을 지우고 번호를 다시 매기면 «다음 문서»가 그 번호를 물려받기 때문이다.
  파일명처럼 안 바뀌는 값으로 지우도록 고쳤고(drop_rows_containing),
  왜 그래야 하는지 함수 주석에 남겼다.

확인: 12종 163쪽 전부 실제 워드로 열어 확인(빈 쪽 0), 두 번 연속 실행해 결과 동일,
남은 문서에 03 참조 0건, 구조적 결함 0.
</commit_message>
<xml_diff>
--- a/docs/government-project/09_산출물목록.docx
+++ b/docs/government-project/09_산출물목록.docx
@@ -1817,18 +1817,15 @@
             </w:tcMar>
           </w:tcPr>
           <w:p>
-            <w:pPr>
-              <w:jc w:val="left"/>
-            </w:pPr>
-            <w:r>
-              <w:rPr>
-                <w:rFonts w:ascii="맑은 고딕" w:cs="맑은 고딕" w:eastAsia="맑은 고딕" w:hAnsi="맑은 고딕"/>
-                <w:b w:val="false"/>
-                <w:bCs w:val="false"/>
-                <w:sz w:val="18"/>
-                <w:szCs w:val="18"/>
-              </w:rPr>
-              <w:t xml:space="preserve">B-01</w:t>
+            <w:r/>
+            <w:r>
+              <w:rPr>
+                <w:rFonts w:ascii="맑은 고딕" w:hAnsi="맑은 고딕"/>
+                <w:b/>
+                <w:sz w:val="18"/>
+                <w:rFonts w:eastAsia="맑은 고딕"/>
+              </w:rPr>
+              <w:t>B-01</w:t>
             </w:r>
           </w:p>
         </w:tc>
@@ -1861,7 +1858,7 @@
                 <w:sz w:val="18"/>
                 <w:szCs w:val="18"/>
               </w:rPr>
-              <w:t xml:space="preserve">03_착수보고서.docx</w:t>
+              <w:t xml:space="preserve">04_중간보고서.docx</w:t>
             </w:r>
           </w:p>
         </w:tc>
@@ -1894,7 +1891,7 @@
                 <w:sz w:val="18"/>
                 <w:szCs w:val="18"/>
               </w:rPr>
-              <w:t xml:space="preserve">2026-04-30</w:t>
+              <w:t>2026-08-19</w:t>
             </w:r>
           </w:p>
         </w:tc>
@@ -1940,7 +1937,7 @@
               <w:bottom w:val="single" w:color="CCCCCC" w:sz="1"/>
               <w:right w:val="single" w:color="CCCCCC" w:sz="1"/>
             </w:tcBorders>
-            <w:shd w:fill="E8F5E9" w:val="clear"/>
+            <w:shd w:fill="FFF9C4" w:val="clear"/>
             <w:tcMar>
               <w:top w:type="dxa" w:w="80"/>
               <w:left w:type="dxa" w:w="120"/>
@@ -1958,7 +1955,7 @@
                 <w:sz w:val="18"/>
                 <w:szCs w:val="18"/>
               </w:rPr>
-              <w:t xml:space="preserve">작성 완료</w:t>
+              <w:t xml:space="preserve">작성 중</w:t>
             </w:r>
           </w:p>
         </w:tc>
@@ -1991,7 +1988,7 @@
                 <w:sz w:val="18"/>
                 <w:szCs w:val="18"/>
               </w:rPr>
-              <w:t xml:space="preserve">착수보고회 사후 정리, 추진체계, 일정, KPI, 위험관리 (~14p)</w:t>
+              <w:t>진척률 96%, KPI 진행, 주요성과, 이슈해결, 예산, 잔여계획 (~18p) — 2026-08-19 갱신 완료</w:t>
             </w:r>
           </w:p>
         </w:tc>
@@ -2015,18 +2012,15 @@
             </w:tcMar>
           </w:tcPr>
           <w:p>
-            <w:pPr>
-              <w:jc w:val="left"/>
-            </w:pPr>
-            <w:r>
-              <w:rPr>
-                <w:rFonts w:ascii="맑은 고딕" w:cs="맑은 고딕" w:eastAsia="맑은 고딕" w:hAnsi="맑은 고딕"/>
-                <w:b w:val="false"/>
-                <w:bCs w:val="false"/>
-                <w:sz w:val="18"/>
-                <w:szCs w:val="18"/>
-              </w:rPr>
-              <w:t xml:space="preserve">B-02</w:t>
+            <w:r/>
+            <w:r>
+              <w:rPr>
+                <w:rFonts w:ascii="맑은 고딕" w:hAnsi="맑은 고딕"/>
+                <w:b/>
+                <w:sz w:val="18"/>
+                <w:rFonts w:eastAsia="맑은 고딕"/>
+              </w:rPr>
+              <w:t>B-02</w:t>
             </w:r>
           </w:p>
         </w:tc>
@@ -2059,7 +2053,7 @@
                 <w:sz w:val="18"/>
                 <w:szCs w:val="18"/>
               </w:rPr>
-              <w:t xml:space="preserve">04_중간보고서.docx</w:t>
+              <w:t xml:space="preserve">05_최종보고서.docx</w:t>
             </w:r>
           </w:p>
         </w:tc>
@@ -2092,7 +2086,7 @@
                 <w:sz w:val="18"/>
                 <w:szCs w:val="18"/>
               </w:rPr>
-              <w:t>2026-08-19</w:t>
+              <w:t xml:space="preserve">2026-04-30</w:t>
             </w:r>
           </w:p>
         </w:tc>
@@ -2189,7 +2183,7 @@
                 <w:sz w:val="18"/>
                 <w:szCs w:val="18"/>
               </w:rPr>
-              <w:t>진척률 96%, KPI 진행, 주요성과, 이슈해결, 예산, 잔여계획 (~18p) — 2026-08-19 갱신 완료</w:t>
+              <w:t xml:space="preserve">사업 종료 템플릿 골격, KPI 실적 [TBD], 기술·사회적 성과 (~22p) — 11월 완성 예정</w:t>
             </w:r>
           </w:p>
         </w:tc>
@@ -2213,18 +2207,15 @@
             </w:tcMar>
           </w:tcPr>
           <w:p>
-            <w:pPr>
-              <w:jc w:val="left"/>
-            </w:pPr>
-            <w:r>
-              <w:rPr>
-                <w:rFonts w:ascii="맑은 고딕" w:cs="맑은 고딕" w:eastAsia="맑은 고딕" w:hAnsi="맑은 고딕"/>
-                <w:b w:val="false"/>
-                <w:bCs w:val="false"/>
-                <w:sz w:val="18"/>
-                <w:szCs w:val="18"/>
-              </w:rPr>
-              <w:t xml:space="preserve">B-03</w:t>
+            <w:r/>
+            <w:r>
+              <w:rPr>
+                <w:rFonts w:ascii="맑은 고딕" w:hAnsi="맑은 고딕"/>
+                <w:b/>
+                <w:sz w:val="18"/>
+                <w:rFonts w:eastAsia="맑은 고딕"/>
+              </w:rPr>
+              <w:t>B-03</w:t>
             </w:r>
           </w:p>
         </w:tc>
@@ -2257,7 +2248,7 @@
                 <w:sz w:val="18"/>
                 <w:szCs w:val="18"/>
               </w:rPr>
-              <w:t xml:space="preserve">05_최종보고서.docx</w:t>
+              <w:t xml:space="preserve">06_사용자매뉴얼.docx</w:t>
             </w:r>
           </w:p>
         </w:tc>
@@ -2290,7 +2281,7 @@
                 <w:sz w:val="18"/>
                 <w:szCs w:val="18"/>
               </w:rPr>
-              <w:t xml:space="preserve">2026-04-30</w:t>
+              <w:t>2026-08-19</w:t>
             </w:r>
           </w:p>
         </w:tc>
@@ -2336,7 +2327,7 @@
               <w:bottom w:val="single" w:color="CCCCCC" w:sz="1"/>
               <w:right w:val="single" w:color="CCCCCC" w:sz="1"/>
             </w:tcBorders>
-            <w:shd w:fill="FFF9C4" w:val="clear"/>
+            <w:shd w:fill="E8F5E9" w:val="clear"/>
             <w:tcMar>
               <w:top w:type="dxa" w:w="80"/>
               <w:left w:type="dxa" w:w="120"/>
@@ -2354,7 +2345,7 @@
                 <w:sz w:val="18"/>
                 <w:szCs w:val="18"/>
               </w:rPr>
-              <w:t xml:space="preserve">작성 중</w:t>
+              <w:t xml:space="preserve">작성 완료</w:t>
             </w:r>
           </w:p>
         </w:tc>
@@ -2387,7 +2378,7 @@
                 <w:sz w:val="18"/>
                 <w:szCs w:val="18"/>
               </w:rPr>
-              <w:t xml:space="preserve">사업 종료 템플릿 골격, KPI 실적 [TBD], 기술·사회적 성과 (~22p) — 11월 완성 예정</w:t>
+              <w:t xml:space="preserve">환자/코디네이터/의료진 3개 사용자군 매뉴얼 (~20p)</w:t>
             </w:r>
           </w:p>
         </w:tc>
@@ -2411,18 +2402,15 @@
             </w:tcMar>
           </w:tcPr>
           <w:p>
-            <w:pPr>
-              <w:jc w:val="left"/>
-            </w:pPr>
-            <w:r>
-              <w:rPr>
-                <w:rFonts w:ascii="맑은 고딕" w:cs="맑은 고딕" w:eastAsia="맑은 고딕" w:hAnsi="맑은 고딕"/>
-                <w:b w:val="false"/>
-                <w:bCs w:val="false"/>
-                <w:sz w:val="18"/>
-                <w:szCs w:val="18"/>
-              </w:rPr>
-              <w:t xml:space="preserve">B-04</w:t>
+            <w:r/>
+            <w:r>
+              <w:rPr>
+                <w:rFonts w:ascii="맑은 고딕" w:hAnsi="맑은 고딕"/>
+                <w:b/>
+                <w:sz w:val="18"/>
+                <w:rFonts w:eastAsia="맑은 고딕"/>
+              </w:rPr>
+              <w:t>B-04</w:t>
             </w:r>
           </w:p>
         </w:tc>
@@ -2455,7 +2443,7 @@
                 <w:sz w:val="18"/>
                 <w:szCs w:val="18"/>
               </w:rPr>
-              <w:t xml:space="preserve">06_사용자매뉴얼.docx</w:t>
+              <w:t xml:space="preserve">07_관리자매뉴얼.docx</w:t>
             </w:r>
           </w:p>
         </w:tc>
@@ -2585,7 +2573,7 @@
                 <w:sz w:val="18"/>
                 <w:szCs w:val="18"/>
               </w:rPr>
-              <w:t xml:space="preserve">환자/코디네이터/의료진 3개 사용자군 매뉴얼 (~20p)</w:t>
+              <w:t xml:space="preserve">어드민 대시보드, 환자관리, 보안대응, 백업·복구 매뉴얼 (~18p)</w:t>
             </w:r>
           </w:p>
         </w:tc>
@@ -2609,18 +2597,15 @@
             </w:tcMar>
           </w:tcPr>
           <w:p>
-            <w:pPr>
-              <w:jc w:val="left"/>
-            </w:pPr>
-            <w:r>
-              <w:rPr>
-                <w:rFonts w:ascii="맑은 고딕" w:cs="맑은 고딕" w:eastAsia="맑은 고딕" w:hAnsi="맑은 고딕"/>
-                <w:b w:val="false"/>
-                <w:bCs w:val="false"/>
-                <w:sz w:val="18"/>
-                <w:szCs w:val="18"/>
-              </w:rPr>
-              <w:t xml:space="preserve">B-05</w:t>
+            <w:r/>
+            <w:r>
+              <w:rPr>
+                <w:rFonts w:ascii="맑은 고딕" w:hAnsi="맑은 고딕"/>
+                <w:b/>
+                <w:sz w:val="18"/>
+                <w:rFonts w:eastAsia="맑은 고딕"/>
+              </w:rPr>
+              <w:t>B-05</w:t>
             </w:r>
           </w:p>
         </w:tc>
@@ -2653,7 +2638,7 @@
                 <w:sz w:val="18"/>
                 <w:szCs w:val="18"/>
               </w:rPr>
-              <w:t xml:space="preserve">07_관리자매뉴얼.docx</w:t>
+              <w:t xml:space="preserve">08_테스트결과서.docx</w:t>
             </w:r>
           </w:p>
         </w:tc>
@@ -2783,7 +2768,7 @@
                 <w:sz w:val="18"/>
                 <w:szCs w:val="18"/>
               </w:rPr>
-              <w:t xml:space="preserve">어드민 대시보드, 환자관리, 보안대응, 백업·복구 매뉴얼 (~18p)</w:t>
+              <w:t xml:space="preserve">테스트 전략, E2E 케이스 목록, 보안 회귀 테스트, 성능 측정 (~12p)</w:t>
             </w:r>
           </w:p>
         </w:tc>
@@ -2807,216 +2792,15 @@
             </w:tcMar>
           </w:tcPr>
           <w:p>
-            <w:pPr>
-              <w:jc w:val="left"/>
-            </w:pPr>
-            <w:r>
-              <w:rPr>
-                <w:rFonts w:ascii="맑은 고딕" w:cs="맑은 고딕" w:eastAsia="맑은 고딕" w:hAnsi="맑은 고딕"/>
-                <w:b w:val="false"/>
-                <w:bCs w:val="false"/>
-                <w:sz w:val="18"/>
-                <w:szCs w:val="18"/>
-              </w:rPr>
-              <w:t xml:space="preserve">B-06</w:t>
-            </w:r>
-          </w:p>
-        </w:tc>
-        <w:tc>
-          <w:tcPr>
-            <w:tcW w:type="dxa" w:w="2200"/>
-            <w:tcBorders>
-              <w:top w:val="single" w:color="CCCCCC" w:sz="1"/>
-              <w:left w:val="single" w:color="CCCCCC" w:sz="1"/>
-              <w:bottom w:val="single" w:color="CCCCCC" w:sz="1"/>
-              <w:right w:val="single" w:color="CCCCCC" w:sz="1"/>
-            </w:tcBorders>
-            <w:shd w:fill="FFFFFF" w:val="clear"/>
-            <w:tcMar>
-              <w:top w:type="dxa" w:w="80"/>
-              <w:left w:type="dxa" w:w="120"/>
-              <w:bottom w:type="dxa" w:w="80"/>
-              <w:right w:type="dxa" w:w="120"/>
-            </w:tcMar>
-          </w:tcPr>
-          <w:p>
-            <w:pPr>
-              <w:jc w:val="left"/>
-            </w:pPr>
-            <w:r>
-              <w:rPr>
-                <w:rFonts w:ascii="맑은 고딕" w:cs="맑은 고딕" w:eastAsia="맑은 고딕" w:hAnsi="맑은 고딕"/>
-                <w:b w:val="false"/>
-                <w:bCs w:val="false"/>
-                <w:sz w:val="18"/>
-                <w:szCs w:val="18"/>
-              </w:rPr>
-              <w:t xml:space="preserve">08_테스트결과서.docx</w:t>
-            </w:r>
-          </w:p>
-        </w:tc>
-        <w:tc>
-          <w:tcPr>
-            <w:tcW w:type="dxa" w:w="1200"/>
-            <w:tcBorders>
-              <w:top w:val="single" w:color="CCCCCC" w:sz="1"/>
-              <w:left w:val="single" w:color="CCCCCC" w:sz="1"/>
-              <w:bottom w:val="single" w:color="CCCCCC" w:sz="1"/>
-              <w:right w:val="single" w:color="CCCCCC" w:sz="1"/>
-            </w:tcBorders>
-            <w:shd w:fill="FFFFFF" w:val="clear"/>
-            <w:tcMar>
-              <w:top w:type="dxa" w:w="80"/>
-              <w:left w:type="dxa" w:w="120"/>
-              <w:bottom w:type="dxa" w:w="80"/>
-              <w:right w:type="dxa" w:w="120"/>
-            </w:tcMar>
-          </w:tcPr>
-          <w:p>
-            <w:pPr>
-              <w:jc w:val="center"/>
-            </w:pPr>
-            <w:r>
-              <w:rPr>
-                <w:rFonts w:ascii="맑은 고딕" w:cs="맑은 고딕" w:eastAsia="맑은 고딕" w:hAnsi="맑은 고딕"/>
-                <w:b w:val="false"/>
-                <w:bCs w:val="false"/>
-                <w:sz w:val="18"/>
-                <w:szCs w:val="18"/>
-              </w:rPr>
-              <w:t>2026-08-19</w:t>
-            </w:r>
-          </w:p>
-        </w:tc>
-        <w:tc>
-          <w:tcPr>
-            <w:tcW w:type="dxa" w:w="1200"/>
-            <w:tcBorders>
-              <w:top w:val="single" w:color="CCCCCC" w:sz="1"/>
-              <w:left w:val="single" w:color="CCCCCC" w:sz="1"/>
-              <w:bottom w:val="single" w:color="CCCCCC" w:sz="1"/>
-              <w:right w:val="single" w:color="CCCCCC" w:sz="1"/>
-            </w:tcBorders>
-            <w:shd w:fill="FFFFFF" w:val="clear"/>
-            <w:tcMar>
-              <w:top w:type="dxa" w:w="80"/>
-              <w:left w:type="dxa" w:w="120"/>
-              <w:bottom w:type="dxa" w:w="80"/>
-              <w:right w:type="dxa" w:w="120"/>
-            </w:tcMar>
-          </w:tcPr>
-          <w:p>
-            <w:pPr>
-              <w:jc w:val="center"/>
-            </w:pPr>
-            <w:r>
-              <w:rPr>
-                <w:rFonts w:ascii="맑은 고딕" w:cs="맑은 고딕" w:eastAsia="맑은 고딕" w:hAnsi="맑은 고딕"/>
-                <w:b w:val="false"/>
-                <w:bCs w:val="false"/>
-                <w:sz w:val="18"/>
-                <w:szCs w:val="18"/>
-              </w:rPr>
-              <w:t xml:space="preserve">본로이 PM</w:t>
-            </w:r>
-          </w:p>
-        </w:tc>
-        <w:tc>
-          <w:tcPr>
-            <w:tcW w:type="dxa" w:w="1000"/>
-            <w:tcBorders>
-              <w:top w:val="single" w:color="CCCCCC" w:sz="1"/>
-              <w:left w:val="single" w:color="CCCCCC" w:sz="1"/>
-              <w:bottom w:val="single" w:color="CCCCCC" w:sz="1"/>
-              <w:right w:val="single" w:color="CCCCCC" w:sz="1"/>
-            </w:tcBorders>
-            <w:shd w:fill="E8F5E9" w:val="clear"/>
-            <w:tcMar>
-              <w:top w:type="dxa" w:w="80"/>
-              <w:left w:type="dxa" w:w="120"/>
-              <w:bottom w:type="dxa" w:w="80"/>
-              <w:right w:type="dxa" w:w="120"/>
-            </w:tcMar>
-          </w:tcPr>
-          <w:p>
-            <w:pPr>
-              <w:jc w:val="center"/>
-            </w:pPr>
-            <w:r>
-              <w:rPr>
-                <w:rFonts w:ascii="맑은 고딕" w:cs="맑은 고딕" w:eastAsia="맑은 고딕" w:hAnsi="맑은 고딕"/>
-                <w:sz w:val="18"/>
-                <w:szCs w:val="18"/>
-              </w:rPr>
-              <w:t xml:space="preserve">작성 완료</w:t>
-            </w:r>
-          </w:p>
-        </w:tc>
-        <w:tc>
-          <w:tcPr>
-            <w:tcW w:type="dxa" w:w="2506"/>
-            <w:tcBorders>
-              <w:top w:val="single" w:color="CCCCCC" w:sz="1"/>
-              <w:left w:val="single" w:color="CCCCCC" w:sz="1"/>
-              <w:bottom w:val="single" w:color="CCCCCC" w:sz="1"/>
-              <w:right w:val="single" w:color="CCCCCC" w:sz="1"/>
-            </w:tcBorders>
-            <w:shd w:fill="FFFFFF" w:val="clear"/>
-            <w:tcMar>
-              <w:top w:type="dxa" w:w="80"/>
-              <w:left w:type="dxa" w:w="120"/>
-              <w:bottom w:type="dxa" w:w="80"/>
-              <w:right w:type="dxa" w:w="120"/>
-            </w:tcMar>
-          </w:tcPr>
-          <w:p>
-            <w:pPr>
-              <w:jc w:val="left"/>
-            </w:pPr>
-            <w:r>
-              <w:rPr>
-                <w:rFonts w:ascii="맑은 고딕" w:cs="맑은 고딕" w:eastAsia="맑은 고딕" w:hAnsi="맑은 고딕"/>
-                <w:b w:val="false"/>
-                <w:bCs w:val="false"/>
-                <w:sz w:val="18"/>
-                <w:szCs w:val="18"/>
-              </w:rPr>
-              <w:t xml:space="preserve">테스트 전략, E2E 케이스 목록, 보안 회귀 테스트, 성능 측정 (~12p)</w:t>
-            </w:r>
-          </w:p>
-        </w:tc>
-      </w:tr>
-      <w:tr>
-        <w:tc>
-          <w:tcPr>
-            <w:tcW w:type="dxa" w:w="400"/>
-            <w:tcBorders>
-              <w:top w:val="single" w:color="CCCCCC" w:sz="1"/>
-              <w:left w:val="single" w:color="CCCCCC" w:sz="1"/>
-              <w:bottom w:val="single" w:color="CCCCCC" w:sz="1"/>
-              <w:right w:val="single" w:color="CCCCCC" w:sz="1"/>
-            </w:tcBorders>
-            <w:shd w:fill="FFFFFF" w:val="clear"/>
-            <w:tcMar>
-              <w:top w:type="dxa" w:w="80"/>
-              <w:left w:type="dxa" w:w="120"/>
-              <w:bottom w:type="dxa" w:w="80"/>
-              <w:right w:type="dxa" w:w="120"/>
-            </w:tcMar>
-          </w:tcPr>
-          <w:p>
-            <w:pPr>
-              <w:jc w:val="left"/>
-            </w:pPr>
-            <w:r>
-              <w:rPr>
-                <w:rFonts w:ascii="맑은 고딕" w:cs="맑은 고딕" w:eastAsia="맑은 고딕" w:hAnsi="맑은 고딕"/>
-                <w:b w:val="false"/>
-                <w:bCs w:val="false"/>
-                <w:sz w:val="18"/>
-                <w:szCs w:val="18"/>
-              </w:rPr>
-              <w:t xml:space="preserve">B-07</w:t>
+            <w:r/>
+            <w:r>
+              <w:rPr>
+                <w:rFonts w:ascii="맑은 고딕" w:hAnsi="맑은 고딕"/>
+                <w:b/>
+                <w:sz w:val="18"/>
+                <w:rFonts w:eastAsia="맑은 고딕"/>
+              </w:rPr>
+              <w:t>B-06</w:t>
             </w:r>
           </w:p>
         </w:tc>
@@ -4621,140 +4405,6 @@
                 <w:szCs w:val="18"/>
               </w:rPr>
               <w:t xml:space="preserve">비고</w:t>
-            </w:r>
-          </w:p>
-        </w:tc>
-      </w:tr>
-      <w:tr>
-        <w:tc>
-          <w:tcPr>
-            <w:tcW w:type="dxa" w:w="1200"/>
-            <w:tcBorders>
-              <w:top w:val="single" w:color="CCCCCC" w:sz="1"/>
-              <w:left w:val="single" w:color="CCCCCC" w:sz="1"/>
-              <w:bottom w:val="single" w:color="CCCCCC" w:sz="1"/>
-              <w:right w:val="single" w:color="CCCCCC" w:sz="1"/>
-            </w:tcBorders>
-            <w:shd w:fill="F5F5F5" w:val="clear"/>
-            <w:tcMar>
-              <w:top w:type="dxa" w:w="80"/>
-              <w:left w:type="dxa" w:w="120"/>
-              <w:bottom w:type="dxa" w:w="80"/>
-              <w:right w:type="dxa" w:w="120"/>
-            </w:tcMar>
-          </w:tcPr>
-          <w:p>
-            <w:pPr>
-              <w:jc w:val="left"/>
-            </w:pPr>
-            <w:r>
-              <w:rPr>
-                <w:rFonts w:ascii="맑은 고딕" w:cs="맑은 고딕" w:eastAsia="맑은 고딕" w:hAnsi="맑은 고딕"/>
-                <w:b w:val="false"/>
-                <w:bCs w:val="false"/>
-                <w:sz w:val="18"/>
-                <w:szCs w:val="18"/>
-              </w:rPr>
-              <w:t xml:space="preserve">2026년 4월</w:t>
-            </w:r>
-          </w:p>
-        </w:tc>
-        <w:tc>
-          <w:tcPr>
-            <w:tcW w:type="dxa" w:w="1800"/>
-            <w:tcBorders>
-              <w:top w:val="single" w:color="CCCCCC" w:sz="1"/>
-              <w:left w:val="single" w:color="CCCCCC" w:sz="1"/>
-              <w:bottom w:val="single" w:color="CCCCCC" w:sz="1"/>
-              <w:right w:val="single" w:color="CCCCCC" w:sz="1"/>
-            </w:tcBorders>
-            <w:shd w:fill="FFFFFF" w:val="clear"/>
-            <w:tcMar>
-              <w:top w:type="dxa" w:w="80"/>
-              <w:left w:type="dxa" w:w="120"/>
-              <w:bottom w:type="dxa" w:w="80"/>
-              <w:right w:type="dxa" w:w="120"/>
-            </w:tcMar>
-          </w:tcPr>
-          <w:p>
-            <w:pPr>
-              <w:jc w:val="left"/>
-            </w:pPr>
-            <w:r>
-              <w:rPr>
-                <w:rFonts w:ascii="맑은 고딕" w:cs="맑은 고딕" w:eastAsia="맑은 고딕" w:hAnsi="맑은 고딕"/>
-                <w:b/>
-                <w:bCs/>
-                <w:sz w:val="18"/>
-                <w:szCs w:val="18"/>
-              </w:rPr>
-              <w:t xml:space="preserve">착수보고</w:t>
-            </w:r>
-          </w:p>
-        </w:tc>
-        <w:tc>
-          <w:tcPr>
-            <w:tcW w:type="dxa" w:w="2500"/>
-            <w:tcBorders>
-              <w:top w:val="single" w:color="CCCCCC" w:sz="1"/>
-              <w:left w:val="single" w:color="CCCCCC" w:sz="1"/>
-              <w:bottom w:val="single" w:color="CCCCCC" w:sz="1"/>
-              <w:right w:val="single" w:color="CCCCCC" w:sz="1"/>
-            </w:tcBorders>
-            <w:shd w:fill="FFFFFF" w:val="clear"/>
-            <w:tcMar>
-              <w:top w:type="dxa" w:w="80"/>
-              <w:left w:type="dxa" w:w="120"/>
-              <w:bottom w:type="dxa" w:w="80"/>
-              <w:right w:type="dxa" w:w="120"/>
-            </w:tcMar>
-          </w:tcPr>
-          <w:p>
-            <w:pPr>
-              <w:jc w:val="left"/>
-            </w:pPr>
-            <w:r>
-              <w:rPr>
-                <w:rFonts w:ascii="맑은 고딕" w:cs="맑은 고딕" w:eastAsia="맑은 고딕" w:hAnsi="맑은 고딕"/>
-                <w:b w:val="false"/>
-                <w:bCs w:val="false"/>
-                <w:sz w:val="18"/>
-                <w:szCs w:val="18"/>
-              </w:rPr>
-              <w:t xml:space="preserve">03_착수보고서.docx</w:t>
-            </w:r>
-          </w:p>
-        </w:tc>
-        <w:tc>
-          <w:tcPr>
-            <w:tcW w:type="dxa" w:w="3006"/>
-            <w:tcBorders>
-              <w:top w:val="single" w:color="CCCCCC" w:sz="1"/>
-              <w:left w:val="single" w:color="CCCCCC" w:sz="1"/>
-              <w:bottom w:val="single" w:color="CCCCCC" w:sz="1"/>
-              <w:right w:val="single" w:color="CCCCCC" w:sz="1"/>
-            </w:tcBorders>
-            <w:shd w:fill="E8F5E9" w:val="clear"/>
-            <w:tcMar>
-              <w:top w:type="dxa" w:w="80"/>
-              <w:left w:type="dxa" w:w="120"/>
-              <w:bottom w:type="dxa" w:w="80"/>
-              <w:right w:type="dxa" w:w="120"/>
-            </w:tcMar>
-          </w:tcPr>
-          <w:p>
-            <w:pPr>
-              <w:jc w:val="left"/>
-            </w:pPr>
-            <w:r>
-              <w:rPr>
-                <w:rFonts w:ascii="맑은 고딕" w:cs="맑은 고딕" w:eastAsia="맑은 고딕" w:hAnsi="맑은 고딕"/>
-                <w:b w:val="false"/>
-                <w:bCs w:val="false"/>
-                <w:sz w:val="18"/>
-                <w:szCs w:val="18"/>
-              </w:rPr>
-              <w:t xml:space="preserve">착수보고회 개최 후 제출 — 완료</w:t>
             </w:r>
           </w:p>
         </w:tc>

</xml_diff>

<commit_message>
chore: 작업 자동 저장 (2026-08-20 15:19)
</commit_message>
<xml_diff>
--- a/docs/government-project/09_산출물목록.docx
+++ b/docs/government-project/09_산출물목록.docx
@@ -1817,18 +1817,15 @@
             </w:tcMar>
           </w:tcPr>
           <w:p>
-            <w:pPr>
-              <w:jc w:val="left"/>
-            </w:pPr>
-            <w:r>
-              <w:rPr>
-                <w:rFonts w:ascii="맑은 고딕" w:cs="맑은 고딕" w:eastAsia="맑은 고딕" w:hAnsi="맑은 고딕"/>
-                <w:b w:val="false"/>
-                <w:bCs w:val="false"/>
-                <w:sz w:val="18"/>
-                <w:szCs w:val="18"/>
-              </w:rPr>
-              <w:t xml:space="preserve">B-01</w:t>
+            <w:r/>
+            <w:r>
+              <w:rPr>
+                <w:rFonts w:ascii="맑은 고딕" w:hAnsi="맑은 고딕"/>
+                <w:b/>
+                <w:sz w:val="18"/>
+                <w:rFonts w:eastAsia="맑은 고딕"/>
+              </w:rPr>
+              <w:t>B-01</w:t>
             </w:r>
           </w:p>
         </w:tc>
@@ -1861,7 +1858,7 @@
                 <w:sz w:val="18"/>
                 <w:szCs w:val="18"/>
               </w:rPr>
-              <w:t xml:space="preserve">03_착수보고서.docx</w:t>
+              <w:t xml:space="preserve">04_중간보고서.docx</w:t>
             </w:r>
           </w:p>
         </w:tc>
@@ -1894,7 +1891,7 @@
                 <w:sz w:val="18"/>
                 <w:szCs w:val="18"/>
               </w:rPr>
-              <w:t xml:space="preserve">2026-04-30</w:t>
+              <w:t>2026-08-19</w:t>
             </w:r>
           </w:p>
         </w:tc>
@@ -1940,7 +1937,7 @@
               <w:bottom w:val="single" w:color="CCCCCC" w:sz="1"/>
               <w:right w:val="single" w:color="CCCCCC" w:sz="1"/>
             </w:tcBorders>
-            <w:shd w:fill="E8F5E9" w:val="clear"/>
+            <w:shd w:fill="FFF9C4" w:val="clear"/>
             <w:tcMar>
               <w:top w:type="dxa" w:w="80"/>
               <w:left w:type="dxa" w:w="120"/>
@@ -1958,7 +1955,7 @@
                 <w:sz w:val="18"/>
                 <w:szCs w:val="18"/>
               </w:rPr>
-              <w:t xml:space="preserve">작성 완료</w:t>
+              <w:t xml:space="preserve">작성 중</w:t>
             </w:r>
           </w:p>
         </w:tc>
@@ -1991,7 +1988,7 @@
                 <w:sz w:val="18"/>
                 <w:szCs w:val="18"/>
               </w:rPr>
-              <w:t xml:space="preserve">착수보고회 사후 정리, 추진체계, 일정, KPI, 위험관리 (~14p)</w:t>
+              <w:t>진척률 96%, KPI 진행, 주요성과, 이슈해결, 예산, 잔여계획 (~18p) — 2026-08-19 갱신 완료</w:t>
             </w:r>
           </w:p>
         </w:tc>
@@ -2015,18 +2012,15 @@
             </w:tcMar>
           </w:tcPr>
           <w:p>
-            <w:pPr>
-              <w:jc w:val="left"/>
-            </w:pPr>
-            <w:r>
-              <w:rPr>
-                <w:rFonts w:ascii="맑은 고딕" w:cs="맑은 고딕" w:eastAsia="맑은 고딕" w:hAnsi="맑은 고딕"/>
-                <w:b w:val="false"/>
-                <w:bCs w:val="false"/>
-                <w:sz w:val="18"/>
-                <w:szCs w:val="18"/>
-              </w:rPr>
-              <w:t xml:space="preserve">B-02</w:t>
+            <w:r/>
+            <w:r>
+              <w:rPr>
+                <w:rFonts w:ascii="맑은 고딕" w:hAnsi="맑은 고딕"/>
+                <w:b/>
+                <w:sz w:val="18"/>
+                <w:rFonts w:eastAsia="맑은 고딕"/>
+              </w:rPr>
+              <w:t>B-02</w:t>
             </w:r>
           </w:p>
         </w:tc>
@@ -2059,7 +2053,7 @@
                 <w:sz w:val="18"/>
                 <w:szCs w:val="18"/>
               </w:rPr>
-              <w:t xml:space="preserve">04_중간보고서.docx</w:t>
+              <w:t xml:space="preserve">05_최종보고서.docx</w:t>
             </w:r>
           </w:p>
         </w:tc>
@@ -2092,7 +2086,7 @@
                 <w:sz w:val="18"/>
                 <w:szCs w:val="18"/>
               </w:rPr>
-              <w:t>2026-08-19</w:t>
+              <w:t xml:space="preserve">2026-04-30</w:t>
             </w:r>
           </w:p>
         </w:tc>
@@ -2189,7 +2183,7 @@
                 <w:sz w:val="18"/>
                 <w:szCs w:val="18"/>
               </w:rPr>
-              <w:t>진척률 96%, KPI 진행, 주요성과, 이슈해결, 예산, 잔여계획 (~18p) — 2026-08-19 갱신 완료</w:t>
+              <w:t xml:space="preserve">사업 종료 템플릿 골격, KPI 실적 [TBD], 기술·사회적 성과 (~22p) — 11월 완성 예정</w:t>
             </w:r>
           </w:p>
         </w:tc>
@@ -2213,18 +2207,15 @@
             </w:tcMar>
           </w:tcPr>
           <w:p>
-            <w:pPr>
-              <w:jc w:val="left"/>
-            </w:pPr>
-            <w:r>
-              <w:rPr>
-                <w:rFonts w:ascii="맑은 고딕" w:cs="맑은 고딕" w:eastAsia="맑은 고딕" w:hAnsi="맑은 고딕"/>
-                <w:b w:val="false"/>
-                <w:bCs w:val="false"/>
-                <w:sz w:val="18"/>
-                <w:szCs w:val="18"/>
-              </w:rPr>
-              <w:t xml:space="preserve">B-03</w:t>
+            <w:r/>
+            <w:r>
+              <w:rPr>
+                <w:rFonts w:ascii="맑은 고딕" w:hAnsi="맑은 고딕"/>
+                <w:b/>
+                <w:sz w:val="18"/>
+                <w:rFonts w:eastAsia="맑은 고딕"/>
+              </w:rPr>
+              <w:t>B-03</w:t>
             </w:r>
           </w:p>
         </w:tc>
@@ -2257,7 +2248,7 @@
                 <w:sz w:val="18"/>
                 <w:szCs w:val="18"/>
               </w:rPr>
-              <w:t xml:space="preserve">05_최종보고서.docx</w:t>
+              <w:t xml:space="preserve">06_사용자매뉴얼.docx</w:t>
             </w:r>
           </w:p>
         </w:tc>
@@ -2290,7 +2281,7 @@
                 <w:sz w:val="18"/>
                 <w:szCs w:val="18"/>
               </w:rPr>
-              <w:t xml:space="preserve">2026-04-30</w:t>
+              <w:t>2026-08-19</w:t>
             </w:r>
           </w:p>
         </w:tc>
@@ -2336,7 +2327,7 @@
               <w:bottom w:val="single" w:color="CCCCCC" w:sz="1"/>
               <w:right w:val="single" w:color="CCCCCC" w:sz="1"/>
             </w:tcBorders>
-            <w:shd w:fill="FFF9C4" w:val="clear"/>
+            <w:shd w:fill="E8F5E9" w:val="clear"/>
             <w:tcMar>
               <w:top w:type="dxa" w:w="80"/>
               <w:left w:type="dxa" w:w="120"/>
@@ -2354,7 +2345,7 @@
                 <w:sz w:val="18"/>
                 <w:szCs w:val="18"/>
               </w:rPr>
-              <w:t xml:space="preserve">작성 중</w:t>
+              <w:t xml:space="preserve">작성 완료</w:t>
             </w:r>
           </w:p>
         </w:tc>
@@ -2387,7 +2378,7 @@
                 <w:sz w:val="18"/>
                 <w:szCs w:val="18"/>
               </w:rPr>
-              <w:t xml:space="preserve">사업 종료 템플릿 골격, KPI 실적 [TBD], 기술·사회적 성과 (~22p) — 11월 완성 예정</w:t>
+              <w:t xml:space="preserve">환자/코디네이터/의료진 3개 사용자군 매뉴얼 (~20p)</w:t>
             </w:r>
           </w:p>
         </w:tc>
@@ -2411,18 +2402,15 @@
             </w:tcMar>
           </w:tcPr>
           <w:p>
-            <w:pPr>
-              <w:jc w:val="left"/>
-            </w:pPr>
-            <w:r>
-              <w:rPr>
-                <w:rFonts w:ascii="맑은 고딕" w:cs="맑은 고딕" w:eastAsia="맑은 고딕" w:hAnsi="맑은 고딕"/>
-                <w:b w:val="false"/>
-                <w:bCs w:val="false"/>
-                <w:sz w:val="18"/>
-                <w:szCs w:val="18"/>
-              </w:rPr>
-              <w:t xml:space="preserve">B-04</w:t>
+            <w:r/>
+            <w:r>
+              <w:rPr>
+                <w:rFonts w:ascii="맑은 고딕" w:hAnsi="맑은 고딕"/>
+                <w:b/>
+                <w:sz w:val="18"/>
+                <w:rFonts w:eastAsia="맑은 고딕"/>
+              </w:rPr>
+              <w:t>B-04</w:t>
             </w:r>
           </w:p>
         </w:tc>
@@ -2455,7 +2443,7 @@
                 <w:sz w:val="18"/>
                 <w:szCs w:val="18"/>
               </w:rPr>
-              <w:t xml:space="preserve">06_사용자매뉴얼.docx</w:t>
+              <w:t xml:space="preserve">07_관리자매뉴얼.docx</w:t>
             </w:r>
           </w:p>
         </w:tc>
@@ -2585,7 +2573,7 @@
                 <w:sz w:val="18"/>
                 <w:szCs w:val="18"/>
               </w:rPr>
-              <w:t xml:space="preserve">환자/코디네이터/의료진 3개 사용자군 매뉴얼 (~20p)</w:t>
+              <w:t xml:space="preserve">어드민 대시보드, 환자관리, 보안대응, 백업·복구 매뉴얼 (~18p)</w:t>
             </w:r>
           </w:p>
         </w:tc>
@@ -2609,18 +2597,15 @@
             </w:tcMar>
           </w:tcPr>
           <w:p>
-            <w:pPr>
-              <w:jc w:val="left"/>
-            </w:pPr>
-            <w:r>
-              <w:rPr>
-                <w:rFonts w:ascii="맑은 고딕" w:cs="맑은 고딕" w:eastAsia="맑은 고딕" w:hAnsi="맑은 고딕"/>
-                <w:b w:val="false"/>
-                <w:bCs w:val="false"/>
-                <w:sz w:val="18"/>
-                <w:szCs w:val="18"/>
-              </w:rPr>
-              <w:t xml:space="preserve">B-05</w:t>
+            <w:r/>
+            <w:r>
+              <w:rPr>
+                <w:rFonts w:ascii="맑은 고딕" w:hAnsi="맑은 고딕"/>
+                <w:b/>
+                <w:sz w:val="18"/>
+                <w:rFonts w:eastAsia="맑은 고딕"/>
+              </w:rPr>
+              <w:t>B-05</w:t>
             </w:r>
           </w:p>
         </w:tc>
@@ -2653,7 +2638,7 @@
                 <w:sz w:val="18"/>
                 <w:szCs w:val="18"/>
               </w:rPr>
-              <w:t xml:space="preserve">07_관리자매뉴얼.docx</w:t>
+              <w:t xml:space="preserve">08_테스트결과서.docx</w:t>
             </w:r>
           </w:p>
         </w:tc>
@@ -2783,7 +2768,7 @@
                 <w:sz w:val="18"/>
                 <w:szCs w:val="18"/>
               </w:rPr>
-              <w:t xml:space="preserve">어드민 대시보드, 환자관리, 보안대응, 백업·복구 매뉴얼 (~18p)</w:t>
+              <w:t xml:space="preserve">테스트 전략, E2E 케이스 목록, 보안 회귀 테스트, 성능 측정 (~12p)</w:t>
             </w:r>
           </w:p>
         </w:tc>
@@ -2807,216 +2792,15 @@
             </w:tcMar>
           </w:tcPr>
           <w:p>
-            <w:pPr>
-              <w:jc w:val="left"/>
-            </w:pPr>
-            <w:r>
-              <w:rPr>
-                <w:rFonts w:ascii="맑은 고딕" w:cs="맑은 고딕" w:eastAsia="맑은 고딕" w:hAnsi="맑은 고딕"/>
-                <w:b w:val="false"/>
-                <w:bCs w:val="false"/>
-                <w:sz w:val="18"/>
-                <w:szCs w:val="18"/>
-              </w:rPr>
-              <w:t xml:space="preserve">B-06</w:t>
-            </w:r>
-          </w:p>
-        </w:tc>
-        <w:tc>
-          <w:tcPr>
-            <w:tcW w:type="dxa" w:w="2200"/>
-            <w:tcBorders>
-              <w:top w:val="single" w:color="CCCCCC" w:sz="1"/>
-              <w:left w:val="single" w:color="CCCCCC" w:sz="1"/>
-              <w:bottom w:val="single" w:color="CCCCCC" w:sz="1"/>
-              <w:right w:val="single" w:color="CCCCCC" w:sz="1"/>
-            </w:tcBorders>
-            <w:shd w:fill="FFFFFF" w:val="clear"/>
-            <w:tcMar>
-              <w:top w:type="dxa" w:w="80"/>
-              <w:left w:type="dxa" w:w="120"/>
-              <w:bottom w:type="dxa" w:w="80"/>
-              <w:right w:type="dxa" w:w="120"/>
-            </w:tcMar>
-          </w:tcPr>
-          <w:p>
-            <w:pPr>
-              <w:jc w:val="left"/>
-            </w:pPr>
-            <w:r>
-              <w:rPr>
-                <w:rFonts w:ascii="맑은 고딕" w:cs="맑은 고딕" w:eastAsia="맑은 고딕" w:hAnsi="맑은 고딕"/>
-                <w:b w:val="false"/>
-                <w:bCs w:val="false"/>
-                <w:sz w:val="18"/>
-                <w:szCs w:val="18"/>
-              </w:rPr>
-              <w:t xml:space="preserve">08_테스트결과서.docx</w:t>
-            </w:r>
-          </w:p>
-        </w:tc>
-        <w:tc>
-          <w:tcPr>
-            <w:tcW w:type="dxa" w:w="1200"/>
-            <w:tcBorders>
-              <w:top w:val="single" w:color="CCCCCC" w:sz="1"/>
-              <w:left w:val="single" w:color="CCCCCC" w:sz="1"/>
-              <w:bottom w:val="single" w:color="CCCCCC" w:sz="1"/>
-              <w:right w:val="single" w:color="CCCCCC" w:sz="1"/>
-            </w:tcBorders>
-            <w:shd w:fill="FFFFFF" w:val="clear"/>
-            <w:tcMar>
-              <w:top w:type="dxa" w:w="80"/>
-              <w:left w:type="dxa" w:w="120"/>
-              <w:bottom w:type="dxa" w:w="80"/>
-              <w:right w:type="dxa" w:w="120"/>
-            </w:tcMar>
-          </w:tcPr>
-          <w:p>
-            <w:pPr>
-              <w:jc w:val="center"/>
-            </w:pPr>
-            <w:r>
-              <w:rPr>
-                <w:rFonts w:ascii="맑은 고딕" w:cs="맑은 고딕" w:eastAsia="맑은 고딕" w:hAnsi="맑은 고딕"/>
-                <w:b w:val="false"/>
-                <w:bCs w:val="false"/>
-                <w:sz w:val="18"/>
-                <w:szCs w:val="18"/>
-              </w:rPr>
-              <w:t>2026-08-19</w:t>
-            </w:r>
-          </w:p>
-        </w:tc>
-        <w:tc>
-          <w:tcPr>
-            <w:tcW w:type="dxa" w:w="1200"/>
-            <w:tcBorders>
-              <w:top w:val="single" w:color="CCCCCC" w:sz="1"/>
-              <w:left w:val="single" w:color="CCCCCC" w:sz="1"/>
-              <w:bottom w:val="single" w:color="CCCCCC" w:sz="1"/>
-              <w:right w:val="single" w:color="CCCCCC" w:sz="1"/>
-            </w:tcBorders>
-            <w:shd w:fill="FFFFFF" w:val="clear"/>
-            <w:tcMar>
-              <w:top w:type="dxa" w:w="80"/>
-              <w:left w:type="dxa" w:w="120"/>
-              <w:bottom w:type="dxa" w:w="80"/>
-              <w:right w:type="dxa" w:w="120"/>
-            </w:tcMar>
-          </w:tcPr>
-          <w:p>
-            <w:pPr>
-              <w:jc w:val="center"/>
-            </w:pPr>
-            <w:r>
-              <w:rPr>
-                <w:rFonts w:ascii="맑은 고딕" w:cs="맑은 고딕" w:eastAsia="맑은 고딕" w:hAnsi="맑은 고딕"/>
-                <w:b w:val="false"/>
-                <w:bCs w:val="false"/>
-                <w:sz w:val="18"/>
-                <w:szCs w:val="18"/>
-              </w:rPr>
-              <w:t xml:space="preserve">본로이 PM</w:t>
-            </w:r>
-          </w:p>
-        </w:tc>
-        <w:tc>
-          <w:tcPr>
-            <w:tcW w:type="dxa" w:w="1000"/>
-            <w:tcBorders>
-              <w:top w:val="single" w:color="CCCCCC" w:sz="1"/>
-              <w:left w:val="single" w:color="CCCCCC" w:sz="1"/>
-              <w:bottom w:val="single" w:color="CCCCCC" w:sz="1"/>
-              <w:right w:val="single" w:color="CCCCCC" w:sz="1"/>
-            </w:tcBorders>
-            <w:shd w:fill="E8F5E9" w:val="clear"/>
-            <w:tcMar>
-              <w:top w:type="dxa" w:w="80"/>
-              <w:left w:type="dxa" w:w="120"/>
-              <w:bottom w:type="dxa" w:w="80"/>
-              <w:right w:type="dxa" w:w="120"/>
-            </w:tcMar>
-          </w:tcPr>
-          <w:p>
-            <w:pPr>
-              <w:jc w:val="center"/>
-            </w:pPr>
-            <w:r>
-              <w:rPr>
-                <w:rFonts w:ascii="맑은 고딕" w:cs="맑은 고딕" w:eastAsia="맑은 고딕" w:hAnsi="맑은 고딕"/>
-                <w:sz w:val="18"/>
-                <w:szCs w:val="18"/>
-              </w:rPr>
-              <w:t xml:space="preserve">작성 완료</w:t>
-            </w:r>
-          </w:p>
-        </w:tc>
-        <w:tc>
-          <w:tcPr>
-            <w:tcW w:type="dxa" w:w="2506"/>
-            <w:tcBorders>
-              <w:top w:val="single" w:color="CCCCCC" w:sz="1"/>
-              <w:left w:val="single" w:color="CCCCCC" w:sz="1"/>
-              <w:bottom w:val="single" w:color="CCCCCC" w:sz="1"/>
-              <w:right w:val="single" w:color="CCCCCC" w:sz="1"/>
-            </w:tcBorders>
-            <w:shd w:fill="FFFFFF" w:val="clear"/>
-            <w:tcMar>
-              <w:top w:type="dxa" w:w="80"/>
-              <w:left w:type="dxa" w:w="120"/>
-              <w:bottom w:type="dxa" w:w="80"/>
-              <w:right w:type="dxa" w:w="120"/>
-            </w:tcMar>
-          </w:tcPr>
-          <w:p>
-            <w:pPr>
-              <w:jc w:val="left"/>
-            </w:pPr>
-            <w:r>
-              <w:rPr>
-                <w:rFonts w:ascii="맑은 고딕" w:cs="맑은 고딕" w:eastAsia="맑은 고딕" w:hAnsi="맑은 고딕"/>
-                <w:b w:val="false"/>
-                <w:bCs w:val="false"/>
-                <w:sz w:val="18"/>
-                <w:szCs w:val="18"/>
-              </w:rPr>
-              <w:t xml:space="preserve">테스트 전략, E2E 케이스 목록, 보안 회귀 테스트, 성능 측정 (~12p)</w:t>
-            </w:r>
-          </w:p>
-        </w:tc>
-      </w:tr>
-      <w:tr>
-        <w:tc>
-          <w:tcPr>
-            <w:tcW w:type="dxa" w:w="400"/>
-            <w:tcBorders>
-              <w:top w:val="single" w:color="CCCCCC" w:sz="1"/>
-              <w:left w:val="single" w:color="CCCCCC" w:sz="1"/>
-              <w:bottom w:val="single" w:color="CCCCCC" w:sz="1"/>
-              <w:right w:val="single" w:color="CCCCCC" w:sz="1"/>
-            </w:tcBorders>
-            <w:shd w:fill="FFFFFF" w:val="clear"/>
-            <w:tcMar>
-              <w:top w:type="dxa" w:w="80"/>
-              <w:left w:type="dxa" w:w="120"/>
-              <w:bottom w:type="dxa" w:w="80"/>
-              <w:right w:type="dxa" w:w="120"/>
-            </w:tcMar>
-          </w:tcPr>
-          <w:p>
-            <w:pPr>
-              <w:jc w:val="left"/>
-            </w:pPr>
-            <w:r>
-              <w:rPr>
-                <w:rFonts w:ascii="맑은 고딕" w:cs="맑은 고딕" w:eastAsia="맑은 고딕" w:hAnsi="맑은 고딕"/>
-                <w:b w:val="false"/>
-                <w:bCs w:val="false"/>
-                <w:sz w:val="18"/>
-                <w:szCs w:val="18"/>
-              </w:rPr>
-              <w:t xml:space="preserve">B-07</w:t>
+            <w:r/>
+            <w:r>
+              <w:rPr>
+                <w:rFonts w:ascii="맑은 고딕" w:hAnsi="맑은 고딕"/>
+                <w:b/>
+                <w:sz w:val="18"/>
+                <w:rFonts w:eastAsia="맑은 고딕"/>
+              </w:rPr>
+              <w:t>B-06</w:t>
             </w:r>
           </w:p>
         </w:tc>
@@ -4621,140 +4405,6 @@
                 <w:szCs w:val="18"/>
               </w:rPr>
               <w:t xml:space="preserve">비고</w:t>
-            </w:r>
-          </w:p>
-        </w:tc>
-      </w:tr>
-      <w:tr>
-        <w:tc>
-          <w:tcPr>
-            <w:tcW w:type="dxa" w:w="1200"/>
-            <w:tcBorders>
-              <w:top w:val="single" w:color="CCCCCC" w:sz="1"/>
-              <w:left w:val="single" w:color="CCCCCC" w:sz="1"/>
-              <w:bottom w:val="single" w:color="CCCCCC" w:sz="1"/>
-              <w:right w:val="single" w:color="CCCCCC" w:sz="1"/>
-            </w:tcBorders>
-            <w:shd w:fill="F5F5F5" w:val="clear"/>
-            <w:tcMar>
-              <w:top w:type="dxa" w:w="80"/>
-              <w:left w:type="dxa" w:w="120"/>
-              <w:bottom w:type="dxa" w:w="80"/>
-              <w:right w:type="dxa" w:w="120"/>
-            </w:tcMar>
-          </w:tcPr>
-          <w:p>
-            <w:pPr>
-              <w:jc w:val="left"/>
-            </w:pPr>
-            <w:r>
-              <w:rPr>
-                <w:rFonts w:ascii="맑은 고딕" w:cs="맑은 고딕" w:eastAsia="맑은 고딕" w:hAnsi="맑은 고딕"/>
-                <w:b w:val="false"/>
-                <w:bCs w:val="false"/>
-                <w:sz w:val="18"/>
-                <w:szCs w:val="18"/>
-              </w:rPr>
-              <w:t xml:space="preserve">2026년 4월</w:t>
-            </w:r>
-          </w:p>
-        </w:tc>
-        <w:tc>
-          <w:tcPr>
-            <w:tcW w:type="dxa" w:w="1800"/>
-            <w:tcBorders>
-              <w:top w:val="single" w:color="CCCCCC" w:sz="1"/>
-              <w:left w:val="single" w:color="CCCCCC" w:sz="1"/>
-              <w:bottom w:val="single" w:color="CCCCCC" w:sz="1"/>
-              <w:right w:val="single" w:color="CCCCCC" w:sz="1"/>
-            </w:tcBorders>
-            <w:shd w:fill="FFFFFF" w:val="clear"/>
-            <w:tcMar>
-              <w:top w:type="dxa" w:w="80"/>
-              <w:left w:type="dxa" w:w="120"/>
-              <w:bottom w:type="dxa" w:w="80"/>
-              <w:right w:type="dxa" w:w="120"/>
-            </w:tcMar>
-          </w:tcPr>
-          <w:p>
-            <w:pPr>
-              <w:jc w:val="left"/>
-            </w:pPr>
-            <w:r>
-              <w:rPr>
-                <w:rFonts w:ascii="맑은 고딕" w:cs="맑은 고딕" w:eastAsia="맑은 고딕" w:hAnsi="맑은 고딕"/>
-                <w:b/>
-                <w:bCs/>
-                <w:sz w:val="18"/>
-                <w:szCs w:val="18"/>
-              </w:rPr>
-              <w:t xml:space="preserve">착수보고</w:t>
-            </w:r>
-          </w:p>
-        </w:tc>
-        <w:tc>
-          <w:tcPr>
-            <w:tcW w:type="dxa" w:w="2500"/>
-            <w:tcBorders>
-              <w:top w:val="single" w:color="CCCCCC" w:sz="1"/>
-              <w:left w:val="single" w:color="CCCCCC" w:sz="1"/>
-              <w:bottom w:val="single" w:color="CCCCCC" w:sz="1"/>
-              <w:right w:val="single" w:color="CCCCCC" w:sz="1"/>
-            </w:tcBorders>
-            <w:shd w:fill="FFFFFF" w:val="clear"/>
-            <w:tcMar>
-              <w:top w:type="dxa" w:w="80"/>
-              <w:left w:type="dxa" w:w="120"/>
-              <w:bottom w:type="dxa" w:w="80"/>
-              <w:right w:type="dxa" w:w="120"/>
-            </w:tcMar>
-          </w:tcPr>
-          <w:p>
-            <w:pPr>
-              <w:jc w:val="left"/>
-            </w:pPr>
-            <w:r>
-              <w:rPr>
-                <w:rFonts w:ascii="맑은 고딕" w:cs="맑은 고딕" w:eastAsia="맑은 고딕" w:hAnsi="맑은 고딕"/>
-                <w:b w:val="false"/>
-                <w:bCs w:val="false"/>
-                <w:sz w:val="18"/>
-                <w:szCs w:val="18"/>
-              </w:rPr>
-              <w:t xml:space="preserve">03_착수보고서.docx</w:t>
-            </w:r>
-          </w:p>
-        </w:tc>
-        <w:tc>
-          <w:tcPr>
-            <w:tcW w:type="dxa" w:w="3006"/>
-            <w:tcBorders>
-              <w:top w:val="single" w:color="CCCCCC" w:sz="1"/>
-              <w:left w:val="single" w:color="CCCCCC" w:sz="1"/>
-              <w:bottom w:val="single" w:color="CCCCCC" w:sz="1"/>
-              <w:right w:val="single" w:color="CCCCCC" w:sz="1"/>
-            </w:tcBorders>
-            <w:shd w:fill="E8F5E9" w:val="clear"/>
-            <w:tcMar>
-              <w:top w:type="dxa" w:w="80"/>
-              <w:left w:type="dxa" w:w="120"/>
-              <w:bottom w:type="dxa" w:w="80"/>
-              <w:right w:type="dxa" w:w="120"/>
-            </w:tcMar>
-          </w:tcPr>
-          <w:p>
-            <w:pPr>
-              <w:jc w:val="left"/>
-            </w:pPr>
-            <w:r>
-              <w:rPr>
-                <w:rFonts w:ascii="맑은 고딕" w:cs="맑은 고딕" w:eastAsia="맑은 고딕" w:hAnsi="맑은 고딕"/>
-                <w:b w:val="false"/>
-                <w:bCs w:val="false"/>
-                <w:sz w:val="18"/>
-                <w:szCs w:val="18"/>
-              </w:rPr>
-              <w:t xml:space="preserve">착수보고회 개최 후 제출 — 완료</w:t>
             </w:r>
           </w:p>
         </w:tc>

</xml_diff>

<commit_message>
03_착수보고서 폐기 (PO 결정 2026-08-20) (#1435)
KHIDI 가 요구한 적 없는 문서인데 이전 세션이 만들어 산출물 목록에 넣어뒀다.
PO 판단: 「그건 그냥 날려버리자. 이전 세션에서 괜히 만든거 같네」.

지운 것
  · docs/government-project/03_착수보고서.docx
  · make_03.cjs · docx_work/make_03.cjs (그 문서 전용 생성기)
  · update_reports.py 의 03 관련 블록 2개
  · 00_INDEX.md 의 03 줄 2개
  · 09_산출물목록의 목록 줄과 제출 일정표 줄, 남은 번호를 B-01 부터 재정렬

⚠️ 실제 착수보고회는 2026-04-16 에 열렸고 발표자료·스크립트·예상질의응답은
PO PC 과제 폴더에 따로 있다. 이번에 지운 것은 그 실물이 아니라, 그것과 별개로
만들어진 우리 쪽 요약 문서다. 기록이 사라지는 게 아니다.

한 번에 못 지운 함정
  drop_row 를 번호(B-01)로 짜서 처음엔 04_중간보고서 줄까지 지워졌다.
  03 줄을 지우고 번호를 다시 매기면 «다음 문서»가 그 번호를 물려받기 때문이다.
  파일명처럼 안 바뀌는 값으로 지우도록 고쳤고(drop_rows_containing),
  왜 그래야 하는지 함수 주석에 남겼다.

확인: 12종 163쪽 전부 실제 워드로 열어 확인(빈 쪽 0), 두 번 연속 실행해 결과 동일,
남은 문서에 03 참조 0건, 구조적 결함 0.
</commit_message>
<xml_diff>
--- a/docs/government-project/09_산출물목록.docx
+++ b/docs/government-project/09_산출물목록.docx
@@ -1817,18 +1817,15 @@
             </w:tcMar>
           </w:tcPr>
           <w:p>
-            <w:pPr>
-              <w:jc w:val="left"/>
-            </w:pPr>
-            <w:r>
-              <w:rPr>
-                <w:rFonts w:ascii="맑은 고딕" w:cs="맑은 고딕" w:eastAsia="맑은 고딕" w:hAnsi="맑은 고딕"/>
-                <w:b w:val="false"/>
-                <w:bCs w:val="false"/>
-                <w:sz w:val="18"/>
-                <w:szCs w:val="18"/>
-              </w:rPr>
-              <w:t xml:space="preserve">B-01</w:t>
+            <w:r/>
+            <w:r>
+              <w:rPr>
+                <w:rFonts w:ascii="맑은 고딕" w:hAnsi="맑은 고딕"/>
+                <w:b/>
+                <w:sz w:val="18"/>
+                <w:rFonts w:eastAsia="맑은 고딕"/>
+              </w:rPr>
+              <w:t>B-01</w:t>
             </w:r>
           </w:p>
         </w:tc>
@@ -1861,7 +1858,7 @@
                 <w:sz w:val="18"/>
                 <w:szCs w:val="18"/>
               </w:rPr>
-              <w:t xml:space="preserve">03_착수보고서.docx</w:t>
+              <w:t xml:space="preserve">04_중간보고서.docx</w:t>
             </w:r>
           </w:p>
         </w:tc>
@@ -1894,7 +1891,7 @@
                 <w:sz w:val="18"/>
                 <w:szCs w:val="18"/>
               </w:rPr>
-              <w:t xml:space="preserve">2026-04-30</w:t>
+              <w:t>2026-08-19</w:t>
             </w:r>
           </w:p>
         </w:tc>
@@ -1940,7 +1937,7 @@
               <w:bottom w:val="single" w:color="CCCCCC" w:sz="1"/>
               <w:right w:val="single" w:color="CCCCCC" w:sz="1"/>
             </w:tcBorders>
-            <w:shd w:fill="E8F5E9" w:val="clear"/>
+            <w:shd w:fill="FFF9C4" w:val="clear"/>
             <w:tcMar>
               <w:top w:type="dxa" w:w="80"/>
               <w:left w:type="dxa" w:w="120"/>
@@ -1958,7 +1955,7 @@
                 <w:sz w:val="18"/>
                 <w:szCs w:val="18"/>
               </w:rPr>
-              <w:t xml:space="preserve">작성 완료</w:t>
+              <w:t xml:space="preserve">작성 중</w:t>
             </w:r>
           </w:p>
         </w:tc>
@@ -1991,7 +1988,7 @@
                 <w:sz w:val="18"/>
                 <w:szCs w:val="18"/>
               </w:rPr>
-              <w:t xml:space="preserve">착수보고회 사후 정리, 추진체계, 일정, KPI, 위험관리 (~14p)</w:t>
+              <w:t>진척률 96%, KPI 진행, 주요성과, 이슈해결, 예산, 잔여계획 (~18p) — 2026-08-19 갱신 완료</w:t>
             </w:r>
           </w:p>
         </w:tc>
@@ -2015,18 +2012,15 @@
             </w:tcMar>
           </w:tcPr>
           <w:p>
-            <w:pPr>
-              <w:jc w:val="left"/>
-            </w:pPr>
-            <w:r>
-              <w:rPr>
-                <w:rFonts w:ascii="맑은 고딕" w:cs="맑은 고딕" w:eastAsia="맑은 고딕" w:hAnsi="맑은 고딕"/>
-                <w:b w:val="false"/>
-                <w:bCs w:val="false"/>
-                <w:sz w:val="18"/>
-                <w:szCs w:val="18"/>
-              </w:rPr>
-              <w:t xml:space="preserve">B-02</w:t>
+            <w:r/>
+            <w:r>
+              <w:rPr>
+                <w:rFonts w:ascii="맑은 고딕" w:hAnsi="맑은 고딕"/>
+                <w:b/>
+                <w:sz w:val="18"/>
+                <w:rFonts w:eastAsia="맑은 고딕"/>
+              </w:rPr>
+              <w:t>B-02</w:t>
             </w:r>
           </w:p>
         </w:tc>
@@ -2059,7 +2053,7 @@
                 <w:sz w:val="18"/>
                 <w:szCs w:val="18"/>
               </w:rPr>
-              <w:t xml:space="preserve">04_중간보고서.docx</w:t>
+              <w:t xml:space="preserve">05_최종보고서.docx</w:t>
             </w:r>
           </w:p>
         </w:tc>
@@ -2092,7 +2086,7 @@
                 <w:sz w:val="18"/>
                 <w:szCs w:val="18"/>
               </w:rPr>
-              <w:t>2026-08-19</w:t>
+              <w:t xml:space="preserve">2026-04-30</w:t>
             </w:r>
           </w:p>
         </w:tc>
@@ -2189,7 +2183,7 @@
                 <w:sz w:val="18"/>
                 <w:szCs w:val="18"/>
               </w:rPr>
-              <w:t>진척률 96%, KPI 진행, 주요성과, 이슈해결, 예산, 잔여계획 (~18p) — 2026-08-19 갱신 완료</w:t>
+              <w:t xml:space="preserve">사업 종료 템플릿 골격, KPI 실적 [TBD], 기술·사회적 성과 (~22p) — 11월 완성 예정</w:t>
             </w:r>
           </w:p>
         </w:tc>
@@ -2213,18 +2207,15 @@
             </w:tcMar>
           </w:tcPr>
           <w:p>
-            <w:pPr>
-              <w:jc w:val="left"/>
-            </w:pPr>
-            <w:r>
-              <w:rPr>
-                <w:rFonts w:ascii="맑은 고딕" w:cs="맑은 고딕" w:eastAsia="맑은 고딕" w:hAnsi="맑은 고딕"/>
-                <w:b w:val="false"/>
-                <w:bCs w:val="false"/>
-                <w:sz w:val="18"/>
-                <w:szCs w:val="18"/>
-              </w:rPr>
-              <w:t xml:space="preserve">B-03</w:t>
+            <w:r/>
+            <w:r>
+              <w:rPr>
+                <w:rFonts w:ascii="맑은 고딕" w:hAnsi="맑은 고딕"/>
+                <w:b/>
+                <w:sz w:val="18"/>
+                <w:rFonts w:eastAsia="맑은 고딕"/>
+              </w:rPr>
+              <w:t>B-03</w:t>
             </w:r>
           </w:p>
         </w:tc>
@@ -2257,7 +2248,7 @@
                 <w:sz w:val="18"/>
                 <w:szCs w:val="18"/>
               </w:rPr>
-              <w:t xml:space="preserve">05_최종보고서.docx</w:t>
+              <w:t xml:space="preserve">06_사용자매뉴얼.docx</w:t>
             </w:r>
           </w:p>
         </w:tc>
@@ -2290,7 +2281,7 @@
                 <w:sz w:val="18"/>
                 <w:szCs w:val="18"/>
               </w:rPr>
-              <w:t xml:space="preserve">2026-04-30</w:t>
+              <w:t>2026-08-19</w:t>
             </w:r>
           </w:p>
         </w:tc>
@@ -2336,7 +2327,7 @@
               <w:bottom w:val="single" w:color="CCCCCC" w:sz="1"/>
               <w:right w:val="single" w:color="CCCCCC" w:sz="1"/>
             </w:tcBorders>
-            <w:shd w:fill="FFF9C4" w:val="clear"/>
+            <w:shd w:fill="E8F5E9" w:val="clear"/>
             <w:tcMar>
               <w:top w:type="dxa" w:w="80"/>
               <w:left w:type="dxa" w:w="120"/>
@@ -2354,7 +2345,7 @@
                 <w:sz w:val="18"/>
                 <w:szCs w:val="18"/>
               </w:rPr>
-              <w:t xml:space="preserve">작성 중</w:t>
+              <w:t xml:space="preserve">작성 완료</w:t>
             </w:r>
           </w:p>
         </w:tc>
@@ -2387,7 +2378,7 @@
                 <w:sz w:val="18"/>
                 <w:szCs w:val="18"/>
               </w:rPr>
-              <w:t xml:space="preserve">사업 종료 템플릿 골격, KPI 실적 [TBD], 기술·사회적 성과 (~22p) — 11월 완성 예정</w:t>
+              <w:t xml:space="preserve">환자/코디네이터/의료진 3개 사용자군 매뉴얼 (~20p)</w:t>
             </w:r>
           </w:p>
         </w:tc>
@@ -2411,18 +2402,15 @@
             </w:tcMar>
           </w:tcPr>
           <w:p>
-            <w:pPr>
-              <w:jc w:val="left"/>
-            </w:pPr>
-            <w:r>
-              <w:rPr>
-                <w:rFonts w:ascii="맑은 고딕" w:cs="맑은 고딕" w:eastAsia="맑은 고딕" w:hAnsi="맑은 고딕"/>
-                <w:b w:val="false"/>
-                <w:bCs w:val="false"/>
-                <w:sz w:val="18"/>
-                <w:szCs w:val="18"/>
-              </w:rPr>
-              <w:t xml:space="preserve">B-04</w:t>
+            <w:r/>
+            <w:r>
+              <w:rPr>
+                <w:rFonts w:ascii="맑은 고딕" w:hAnsi="맑은 고딕"/>
+                <w:b/>
+                <w:sz w:val="18"/>
+                <w:rFonts w:eastAsia="맑은 고딕"/>
+              </w:rPr>
+              <w:t>B-04</w:t>
             </w:r>
           </w:p>
         </w:tc>
@@ -2455,7 +2443,7 @@
                 <w:sz w:val="18"/>
                 <w:szCs w:val="18"/>
               </w:rPr>
-              <w:t xml:space="preserve">06_사용자매뉴얼.docx</w:t>
+              <w:t xml:space="preserve">07_관리자매뉴얼.docx</w:t>
             </w:r>
           </w:p>
         </w:tc>
@@ -2585,7 +2573,7 @@
                 <w:sz w:val="18"/>
                 <w:szCs w:val="18"/>
               </w:rPr>
-              <w:t xml:space="preserve">환자/코디네이터/의료진 3개 사용자군 매뉴얼 (~20p)</w:t>
+              <w:t xml:space="preserve">어드민 대시보드, 환자관리, 보안대응, 백업·복구 매뉴얼 (~18p)</w:t>
             </w:r>
           </w:p>
         </w:tc>
@@ -2609,18 +2597,15 @@
             </w:tcMar>
           </w:tcPr>
           <w:p>
-            <w:pPr>
-              <w:jc w:val="left"/>
-            </w:pPr>
-            <w:r>
-              <w:rPr>
-                <w:rFonts w:ascii="맑은 고딕" w:cs="맑은 고딕" w:eastAsia="맑은 고딕" w:hAnsi="맑은 고딕"/>
-                <w:b w:val="false"/>
-                <w:bCs w:val="false"/>
-                <w:sz w:val="18"/>
-                <w:szCs w:val="18"/>
-              </w:rPr>
-              <w:t xml:space="preserve">B-05</w:t>
+            <w:r/>
+            <w:r>
+              <w:rPr>
+                <w:rFonts w:ascii="맑은 고딕" w:hAnsi="맑은 고딕"/>
+                <w:b/>
+                <w:sz w:val="18"/>
+                <w:rFonts w:eastAsia="맑은 고딕"/>
+              </w:rPr>
+              <w:t>B-05</w:t>
             </w:r>
           </w:p>
         </w:tc>
@@ -2653,7 +2638,7 @@
                 <w:sz w:val="18"/>
                 <w:szCs w:val="18"/>
               </w:rPr>
-              <w:t xml:space="preserve">07_관리자매뉴얼.docx</w:t>
+              <w:t xml:space="preserve">08_테스트결과서.docx</w:t>
             </w:r>
           </w:p>
         </w:tc>
@@ -2783,7 +2768,7 @@
                 <w:sz w:val="18"/>
                 <w:szCs w:val="18"/>
               </w:rPr>
-              <w:t xml:space="preserve">어드민 대시보드, 환자관리, 보안대응, 백업·복구 매뉴얼 (~18p)</w:t>
+              <w:t xml:space="preserve">테스트 전략, E2E 케이스 목록, 보안 회귀 테스트, 성능 측정 (~12p)</w:t>
             </w:r>
           </w:p>
         </w:tc>
@@ -2807,216 +2792,15 @@
             </w:tcMar>
           </w:tcPr>
           <w:p>
-            <w:pPr>
-              <w:jc w:val="left"/>
-            </w:pPr>
-            <w:r>
-              <w:rPr>
-                <w:rFonts w:ascii="맑은 고딕" w:cs="맑은 고딕" w:eastAsia="맑은 고딕" w:hAnsi="맑은 고딕"/>
-                <w:b w:val="false"/>
-                <w:bCs w:val="false"/>
-                <w:sz w:val="18"/>
-                <w:szCs w:val="18"/>
-              </w:rPr>
-              <w:t xml:space="preserve">B-06</w:t>
-            </w:r>
-          </w:p>
-        </w:tc>
-        <w:tc>
-          <w:tcPr>
-            <w:tcW w:type="dxa" w:w="2200"/>
-            <w:tcBorders>
-              <w:top w:val="single" w:color="CCCCCC" w:sz="1"/>
-              <w:left w:val="single" w:color="CCCCCC" w:sz="1"/>
-              <w:bottom w:val="single" w:color="CCCCCC" w:sz="1"/>
-              <w:right w:val="single" w:color="CCCCCC" w:sz="1"/>
-            </w:tcBorders>
-            <w:shd w:fill="FFFFFF" w:val="clear"/>
-            <w:tcMar>
-              <w:top w:type="dxa" w:w="80"/>
-              <w:left w:type="dxa" w:w="120"/>
-              <w:bottom w:type="dxa" w:w="80"/>
-              <w:right w:type="dxa" w:w="120"/>
-            </w:tcMar>
-          </w:tcPr>
-          <w:p>
-            <w:pPr>
-              <w:jc w:val="left"/>
-            </w:pPr>
-            <w:r>
-              <w:rPr>
-                <w:rFonts w:ascii="맑은 고딕" w:cs="맑은 고딕" w:eastAsia="맑은 고딕" w:hAnsi="맑은 고딕"/>
-                <w:b w:val="false"/>
-                <w:bCs w:val="false"/>
-                <w:sz w:val="18"/>
-                <w:szCs w:val="18"/>
-              </w:rPr>
-              <w:t xml:space="preserve">08_테스트결과서.docx</w:t>
-            </w:r>
-          </w:p>
-        </w:tc>
-        <w:tc>
-          <w:tcPr>
-            <w:tcW w:type="dxa" w:w="1200"/>
-            <w:tcBorders>
-              <w:top w:val="single" w:color="CCCCCC" w:sz="1"/>
-              <w:left w:val="single" w:color="CCCCCC" w:sz="1"/>
-              <w:bottom w:val="single" w:color="CCCCCC" w:sz="1"/>
-              <w:right w:val="single" w:color="CCCCCC" w:sz="1"/>
-            </w:tcBorders>
-            <w:shd w:fill="FFFFFF" w:val="clear"/>
-            <w:tcMar>
-              <w:top w:type="dxa" w:w="80"/>
-              <w:left w:type="dxa" w:w="120"/>
-              <w:bottom w:type="dxa" w:w="80"/>
-              <w:right w:type="dxa" w:w="120"/>
-            </w:tcMar>
-          </w:tcPr>
-          <w:p>
-            <w:pPr>
-              <w:jc w:val="center"/>
-            </w:pPr>
-            <w:r>
-              <w:rPr>
-                <w:rFonts w:ascii="맑은 고딕" w:cs="맑은 고딕" w:eastAsia="맑은 고딕" w:hAnsi="맑은 고딕"/>
-                <w:b w:val="false"/>
-                <w:bCs w:val="false"/>
-                <w:sz w:val="18"/>
-                <w:szCs w:val="18"/>
-              </w:rPr>
-              <w:t>2026-08-19</w:t>
-            </w:r>
-          </w:p>
-        </w:tc>
-        <w:tc>
-          <w:tcPr>
-            <w:tcW w:type="dxa" w:w="1200"/>
-            <w:tcBorders>
-              <w:top w:val="single" w:color="CCCCCC" w:sz="1"/>
-              <w:left w:val="single" w:color="CCCCCC" w:sz="1"/>
-              <w:bottom w:val="single" w:color="CCCCCC" w:sz="1"/>
-              <w:right w:val="single" w:color="CCCCCC" w:sz="1"/>
-            </w:tcBorders>
-            <w:shd w:fill="FFFFFF" w:val="clear"/>
-            <w:tcMar>
-              <w:top w:type="dxa" w:w="80"/>
-              <w:left w:type="dxa" w:w="120"/>
-              <w:bottom w:type="dxa" w:w="80"/>
-              <w:right w:type="dxa" w:w="120"/>
-            </w:tcMar>
-          </w:tcPr>
-          <w:p>
-            <w:pPr>
-              <w:jc w:val="center"/>
-            </w:pPr>
-            <w:r>
-              <w:rPr>
-                <w:rFonts w:ascii="맑은 고딕" w:cs="맑은 고딕" w:eastAsia="맑은 고딕" w:hAnsi="맑은 고딕"/>
-                <w:b w:val="false"/>
-                <w:bCs w:val="false"/>
-                <w:sz w:val="18"/>
-                <w:szCs w:val="18"/>
-              </w:rPr>
-              <w:t xml:space="preserve">본로이 PM</w:t>
-            </w:r>
-          </w:p>
-        </w:tc>
-        <w:tc>
-          <w:tcPr>
-            <w:tcW w:type="dxa" w:w="1000"/>
-            <w:tcBorders>
-              <w:top w:val="single" w:color="CCCCCC" w:sz="1"/>
-              <w:left w:val="single" w:color="CCCCCC" w:sz="1"/>
-              <w:bottom w:val="single" w:color="CCCCCC" w:sz="1"/>
-              <w:right w:val="single" w:color="CCCCCC" w:sz="1"/>
-            </w:tcBorders>
-            <w:shd w:fill="E8F5E9" w:val="clear"/>
-            <w:tcMar>
-              <w:top w:type="dxa" w:w="80"/>
-              <w:left w:type="dxa" w:w="120"/>
-              <w:bottom w:type="dxa" w:w="80"/>
-              <w:right w:type="dxa" w:w="120"/>
-            </w:tcMar>
-          </w:tcPr>
-          <w:p>
-            <w:pPr>
-              <w:jc w:val="center"/>
-            </w:pPr>
-            <w:r>
-              <w:rPr>
-                <w:rFonts w:ascii="맑은 고딕" w:cs="맑은 고딕" w:eastAsia="맑은 고딕" w:hAnsi="맑은 고딕"/>
-                <w:sz w:val="18"/>
-                <w:szCs w:val="18"/>
-              </w:rPr>
-              <w:t xml:space="preserve">작성 완료</w:t>
-            </w:r>
-          </w:p>
-        </w:tc>
-        <w:tc>
-          <w:tcPr>
-            <w:tcW w:type="dxa" w:w="2506"/>
-            <w:tcBorders>
-              <w:top w:val="single" w:color="CCCCCC" w:sz="1"/>
-              <w:left w:val="single" w:color="CCCCCC" w:sz="1"/>
-              <w:bottom w:val="single" w:color="CCCCCC" w:sz="1"/>
-              <w:right w:val="single" w:color="CCCCCC" w:sz="1"/>
-            </w:tcBorders>
-            <w:shd w:fill="FFFFFF" w:val="clear"/>
-            <w:tcMar>
-              <w:top w:type="dxa" w:w="80"/>
-              <w:left w:type="dxa" w:w="120"/>
-              <w:bottom w:type="dxa" w:w="80"/>
-              <w:right w:type="dxa" w:w="120"/>
-            </w:tcMar>
-          </w:tcPr>
-          <w:p>
-            <w:pPr>
-              <w:jc w:val="left"/>
-            </w:pPr>
-            <w:r>
-              <w:rPr>
-                <w:rFonts w:ascii="맑은 고딕" w:cs="맑은 고딕" w:eastAsia="맑은 고딕" w:hAnsi="맑은 고딕"/>
-                <w:b w:val="false"/>
-                <w:bCs w:val="false"/>
-                <w:sz w:val="18"/>
-                <w:szCs w:val="18"/>
-              </w:rPr>
-              <w:t xml:space="preserve">테스트 전략, E2E 케이스 목록, 보안 회귀 테스트, 성능 측정 (~12p)</w:t>
-            </w:r>
-          </w:p>
-        </w:tc>
-      </w:tr>
-      <w:tr>
-        <w:tc>
-          <w:tcPr>
-            <w:tcW w:type="dxa" w:w="400"/>
-            <w:tcBorders>
-              <w:top w:val="single" w:color="CCCCCC" w:sz="1"/>
-              <w:left w:val="single" w:color="CCCCCC" w:sz="1"/>
-              <w:bottom w:val="single" w:color="CCCCCC" w:sz="1"/>
-              <w:right w:val="single" w:color="CCCCCC" w:sz="1"/>
-            </w:tcBorders>
-            <w:shd w:fill="FFFFFF" w:val="clear"/>
-            <w:tcMar>
-              <w:top w:type="dxa" w:w="80"/>
-              <w:left w:type="dxa" w:w="120"/>
-              <w:bottom w:type="dxa" w:w="80"/>
-              <w:right w:type="dxa" w:w="120"/>
-            </w:tcMar>
-          </w:tcPr>
-          <w:p>
-            <w:pPr>
-              <w:jc w:val="left"/>
-            </w:pPr>
-            <w:r>
-              <w:rPr>
-                <w:rFonts w:ascii="맑은 고딕" w:cs="맑은 고딕" w:eastAsia="맑은 고딕" w:hAnsi="맑은 고딕"/>
-                <w:b w:val="false"/>
-                <w:bCs w:val="false"/>
-                <w:sz w:val="18"/>
-                <w:szCs w:val="18"/>
-              </w:rPr>
-              <w:t xml:space="preserve">B-07</w:t>
+            <w:r/>
+            <w:r>
+              <w:rPr>
+                <w:rFonts w:ascii="맑은 고딕" w:hAnsi="맑은 고딕"/>
+                <w:b/>
+                <w:sz w:val="18"/>
+                <w:rFonts w:eastAsia="맑은 고딕"/>
+              </w:rPr>
+              <w:t>B-06</w:t>
             </w:r>
           </w:p>
         </w:tc>
@@ -4621,140 +4405,6 @@
                 <w:szCs w:val="18"/>
               </w:rPr>
               <w:t xml:space="preserve">비고</w:t>
-            </w:r>
-          </w:p>
-        </w:tc>
-      </w:tr>
-      <w:tr>
-        <w:tc>
-          <w:tcPr>
-            <w:tcW w:type="dxa" w:w="1200"/>
-            <w:tcBorders>
-              <w:top w:val="single" w:color="CCCCCC" w:sz="1"/>
-              <w:left w:val="single" w:color="CCCCCC" w:sz="1"/>
-              <w:bottom w:val="single" w:color="CCCCCC" w:sz="1"/>
-              <w:right w:val="single" w:color="CCCCCC" w:sz="1"/>
-            </w:tcBorders>
-            <w:shd w:fill="F5F5F5" w:val="clear"/>
-            <w:tcMar>
-              <w:top w:type="dxa" w:w="80"/>
-              <w:left w:type="dxa" w:w="120"/>
-              <w:bottom w:type="dxa" w:w="80"/>
-              <w:right w:type="dxa" w:w="120"/>
-            </w:tcMar>
-          </w:tcPr>
-          <w:p>
-            <w:pPr>
-              <w:jc w:val="left"/>
-            </w:pPr>
-            <w:r>
-              <w:rPr>
-                <w:rFonts w:ascii="맑은 고딕" w:cs="맑은 고딕" w:eastAsia="맑은 고딕" w:hAnsi="맑은 고딕"/>
-                <w:b w:val="false"/>
-                <w:bCs w:val="false"/>
-                <w:sz w:val="18"/>
-                <w:szCs w:val="18"/>
-              </w:rPr>
-              <w:t xml:space="preserve">2026년 4월</w:t>
-            </w:r>
-          </w:p>
-        </w:tc>
-        <w:tc>
-          <w:tcPr>
-            <w:tcW w:type="dxa" w:w="1800"/>
-            <w:tcBorders>
-              <w:top w:val="single" w:color="CCCCCC" w:sz="1"/>
-              <w:left w:val="single" w:color="CCCCCC" w:sz="1"/>
-              <w:bottom w:val="single" w:color="CCCCCC" w:sz="1"/>
-              <w:right w:val="single" w:color="CCCCCC" w:sz="1"/>
-            </w:tcBorders>
-            <w:shd w:fill="FFFFFF" w:val="clear"/>
-            <w:tcMar>
-              <w:top w:type="dxa" w:w="80"/>
-              <w:left w:type="dxa" w:w="120"/>
-              <w:bottom w:type="dxa" w:w="80"/>
-              <w:right w:type="dxa" w:w="120"/>
-            </w:tcMar>
-          </w:tcPr>
-          <w:p>
-            <w:pPr>
-              <w:jc w:val="left"/>
-            </w:pPr>
-            <w:r>
-              <w:rPr>
-                <w:rFonts w:ascii="맑은 고딕" w:cs="맑은 고딕" w:eastAsia="맑은 고딕" w:hAnsi="맑은 고딕"/>
-                <w:b/>
-                <w:bCs/>
-                <w:sz w:val="18"/>
-                <w:szCs w:val="18"/>
-              </w:rPr>
-              <w:t xml:space="preserve">착수보고</w:t>
-            </w:r>
-          </w:p>
-        </w:tc>
-        <w:tc>
-          <w:tcPr>
-            <w:tcW w:type="dxa" w:w="2500"/>
-            <w:tcBorders>
-              <w:top w:val="single" w:color="CCCCCC" w:sz="1"/>
-              <w:left w:val="single" w:color="CCCCCC" w:sz="1"/>
-              <w:bottom w:val="single" w:color="CCCCCC" w:sz="1"/>
-              <w:right w:val="single" w:color="CCCCCC" w:sz="1"/>
-            </w:tcBorders>
-            <w:shd w:fill="FFFFFF" w:val="clear"/>
-            <w:tcMar>
-              <w:top w:type="dxa" w:w="80"/>
-              <w:left w:type="dxa" w:w="120"/>
-              <w:bottom w:type="dxa" w:w="80"/>
-              <w:right w:type="dxa" w:w="120"/>
-            </w:tcMar>
-          </w:tcPr>
-          <w:p>
-            <w:pPr>
-              <w:jc w:val="left"/>
-            </w:pPr>
-            <w:r>
-              <w:rPr>
-                <w:rFonts w:ascii="맑은 고딕" w:cs="맑은 고딕" w:eastAsia="맑은 고딕" w:hAnsi="맑은 고딕"/>
-                <w:b w:val="false"/>
-                <w:bCs w:val="false"/>
-                <w:sz w:val="18"/>
-                <w:szCs w:val="18"/>
-              </w:rPr>
-              <w:t xml:space="preserve">03_착수보고서.docx</w:t>
-            </w:r>
-          </w:p>
-        </w:tc>
-        <w:tc>
-          <w:tcPr>
-            <w:tcW w:type="dxa" w:w="3006"/>
-            <w:tcBorders>
-              <w:top w:val="single" w:color="CCCCCC" w:sz="1"/>
-              <w:left w:val="single" w:color="CCCCCC" w:sz="1"/>
-              <w:bottom w:val="single" w:color="CCCCCC" w:sz="1"/>
-              <w:right w:val="single" w:color="CCCCCC" w:sz="1"/>
-            </w:tcBorders>
-            <w:shd w:fill="E8F5E9" w:val="clear"/>
-            <w:tcMar>
-              <w:top w:type="dxa" w:w="80"/>
-              <w:left w:type="dxa" w:w="120"/>
-              <w:bottom w:type="dxa" w:w="80"/>
-              <w:right w:type="dxa" w:w="120"/>
-            </w:tcMar>
-          </w:tcPr>
-          <w:p>
-            <w:pPr>
-              <w:jc w:val="left"/>
-            </w:pPr>
-            <w:r>
-              <w:rPr>
-                <w:rFonts w:ascii="맑은 고딕" w:cs="맑은 고딕" w:eastAsia="맑은 고딕" w:hAnsi="맑은 고딕"/>
-                <w:b w:val="false"/>
-                <w:bCs w:val="false"/>
-                <w:sz w:val="18"/>
-                <w:szCs w:val="18"/>
-              </w:rPr>
-              <w:t xml:space="preserve">착수보고회 개최 후 제출 — 완료</w:t>
             </w:r>
           </w:p>
         </w:tc>

</xml_diff>

<commit_message>
chore: 작업 자동 저장 (2026-08-20 16:02)
</commit_message>
<xml_diff>
--- a/docs/government-project/09_산출물목록.docx
+++ b/docs/government-project/09_산출물목록.docx
@@ -1858,7 +1858,7 @@
                 <w:sz w:val="18"/>
                 <w:szCs w:val="18"/>
               </w:rPr>
-              <w:t xml:space="preserve">04_중간보고서.docx</w:t>
+              <w:t xml:space="preserve">06_사용자매뉴얼.docx</w:t>
             </w:r>
           </w:p>
         </w:tc>
@@ -1937,7 +1937,7 @@
               <w:bottom w:val="single" w:color="CCCCCC" w:sz="1"/>
               <w:right w:val="single" w:color="CCCCCC" w:sz="1"/>
             </w:tcBorders>
-            <w:shd w:fill="FFF9C4" w:val="clear"/>
+            <w:shd w:fill="E8F5E9" w:val="clear"/>
             <w:tcMar>
               <w:top w:type="dxa" w:w="80"/>
               <w:left w:type="dxa" w:w="120"/>
@@ -1955,7 +1955,7 @@
                 <w:sz w:val="18"/>
                 <w:szCs w:val="18"/>
               </w:rPr>
-              <w:t xml:space="preserve">작성 중</w:t>
+              <w:t xml:space="preserve">작성 완료</w:t>
             </w:r>
           </w:p>
         </w:tc>
@@ -1988,7 +1988,7 @@
                 <w:sz w:val="18"/>
                 <w:szCs w:val="18"/>
               </w:rPr>
-              <w:t>진척률 96%, KPI 진행, 주요성과, 이슈해결, 예산, 잔여계획 (~18p) — 2026-08-19 갱신 완료</w:t>
+              <w:t xml:space="preserve">환자/코디네이터/의료진 3개 사용자군 매뉴얼 (~20p)</w:t>
             </w:r>
           </w:p>
         </w:tc>
@@ -2053,7 +2053,7 @@
                 <w:sz w:val="18"/>
                 <w:szCs w:val="18"/>
               </w:rPr>
-              <w:t xml:space="preserve">05_최종보고서.docx</w:t>
+              <w:t xml:space="preserve">07_관리자매뉴얼.docx</w:t>
             </w:r>
           </w:p>
         </w:tc>
@@ -2086,7 +2086,7 @@
                 <w:sz w:val="18"/>
                 <w:szCs w:val="18"/>
               </w:rPr>
-              <w:t xml:space="preserve">2026-04-30</w:t>
+              <w:t>2026-08-19</w:t>
             </w:r>
           </w:p>
         </w:tc>
@@ -2132,7 +2132,7 @@
               <w:bottom w:val="single" w:color="CCCCCC" w:sz="1"/>
               <w:right w:val="single" w:color="CCCCCC" w:sz="1"/>
             </w:tcBorders>
-            <w:shd w:fill="FFF9C4" w:val="clear"/>
+            <w:shd w:fill="E8F5E9" w:val="clear"/>
             <w:tcMar>
               <w:top w:type="dxa" w:w="80"/>
               <w:left w:type="dxa" w:w="120"/>
@@ -2150,7 +2150,7 @@
                 <w:sz w:val="18"/>
                 <w:szCs w:val="18"/>
               </w:rPr>
-              <w:t xml:space="preserve">작성 중</w:t>
+              <w:t xml:space="preserve">작성 완료</w:t>
             </w:r>
           </w:p>
         </w:tc>
@@ -2183,7 +2183,7 @@
                 <w:sz w:val="18"/>
                 <w:szCs w:val="18"/>
               </w:rPr>
-              <w:t xml:space="preserve">사업 종료 템플릿 골격, KPI 실적 [TBD], 기술·사회적 성과 (~22p) — 11월 완성 예정</w:t>
+              <w:t xml:space="preserve">어드민 대시보드, 환자관리, 보안대응, 백업·복구 매뉴얼 (~18p)</w:t>
             </w:r>
           </w:p>
         </w:tc>
@@ -2248,7 +2248,7 @@
                 <w:sz w:val="18"/>
                 <w:szCs w:val="18"/>
               </w:rPr>
-              <w:t xml:space="preserve">06_사용자매뉴얼.docx</w:t>
+              <w:t xml:space="preserve">08_테스트결과서.docx</w:t>
             </w:r>
           </w:p>
         </w:tc>
@@ -2378,7 +2378,7 @@
                 <w:sz w:val="18"/>
                 <w:szCs w:val="18"/>
               </w:rPr>
-              <w:t xml:space="preserve">환자/코디네이터/의료진 3개 사용자군 매뉴얼 (~20p)</w:t>
+              <w:t xml:space="preserve">테스트 전략, E2E 케이스 목록, 보안 회귀 테스트, 성능 측정 (~12p)</w:t>
             </w:r>
           </w:p>
         </w:tc>
@@ -2411,396 +2411,6 @@
                 <w:rFonts w:eastAsia="맑은 고딕"/>
               </w:rPr>
               <w:t>B-04</w:t>
-            </w:r>
-          </w:p>
-        </w:tc>
-        <w:tc>
-          <w:tcPr>
-            <w:tcW w:type="dxa" w:w="2200"/>
-            <w:tcBorders>
-              <w:top w:val="single" w:color="CCCCCC" w:sz="1"/>
-              <w:left w:val="single" w:color="CCCCCC" w:sz="1"/>
-              <w:bottom w:val="single" w:color="CCCCCC" w:sz="1"/>
-              <w:right w:val="single" w:color="CCCCCC" w:sz="1"/>
-            </w:tcBorders>
-            <w:shd w:fill="FFFFFF" w:val="clear"/>
-            <w:tcMar>
-              <w:top w:type="dxa" w:w="80"/>
-              <w:left w:type="dxa" w:w="120"/>
-              <w:bottom w:type="dxa" w:w="80"/>
-              <w:right w:type="dxa" w:w="120"/>
-            </w:tcMar>
-          </w:tcPr>
-          <w:p>
-            <w:pPr>
-              <w:jc w:val="left"/>
-            </w:pPr>
-            <w:r>
-              <w:rPr>
-                <w:rFonts w:ascii="맑은 고딕" w:cs="맑은 고딕" w:eastAsia="맑은 고딕" w:hAnsi="맑은 고딕"/>
-                <w:b w:val="false"/>
-                <w:bCs w:val="false"/>
-                <w:sz w:val="18"/>
-                <w:szCs w:val="18"/>
-              </w:rPr>
-              <w:t xml:space="preserve">07_관리자매뉴얼.docx</w:t>
-            </w:r>
-          </w:p>
-        </w:tc>
-        <w:tc>
-          <w:tcPr>
-            <w:tcW w:type="dxa" w:w="1200"/>
-            <w:tcBorders>
-              <w:top w:val="single" w:color="CCCCCC" w:sz="1"/>
-              <w:left w:val="single" w:color="CCCCCC" w:sz="1"/>
-              <w:bottom w:val="single" w:color="CCCCCC" w:sz="1"/>
-              <w:right w:val="single" w:color="CCCCCC" w:sz="1"/>
-            </w:tcBorders>
-            <w:shd w:fill="FFFFFF" w:val="clear"/>
-            <w:tcMar>
-              <w:top w:type="dxa" w:w="80"/>
-              <w:left w:type="dxa" w:w="120"/>
-              <w:bottom w:type="dxa" w:w="80"/>
-              <w:right w:type="dxa" w:w="120"/>
-            </w:tcMar>
-          </w:tcPr>
-          <w:p>
-            <w:pPr>
-              <w:jc w:val="center"/>
-            </w:pPr>
-            <w:r>
-              <w:rPr>
-                <w:rFonts w:ascii="맑은 고딕" w:cs="맑은 고딕" w:eastAsia="맑은 고딕" w:hAnsi="맑은 고딕"/>
-                <w:b w:val="false"/>
-                <w:bCs w:val="false"/>
-                <w:sz w:val="18"/>
-                <w:szCs w:val="18"/>
-              </w:rPr>
-              <w:t>2026-08-19</w:t>
-            </w:r>
-          </w:p>
-        </w:tc>
-        <w:tc>
-          <w:tcPr>
-            <w:tcW w:type="dxa" w:w="1200"/>
-            <w:tcBorders>
-              <w:top w:val="single" w:color="CCCCCC" w:sz="1"/>
-              <w:left w:val="single" w:color="CCCCCC" w:sz="1"/>
-              <w:bottom w:val="single" w:color="CCCCCC" w:sz="1"/>
-              <w:right w:val="single" w:color="CCCCCC" w:sz="1"/>
-            </w:tcBorders>
-            <w:shd w:fill="FFFFFF" w:val="clear"/>
-            <w:tcMar>
-              <w:top w:type="dxa" w:w="80"/>
-              <w:left w:type="dxa" w:w="120"/>
-              <w:bottom w:type="dxa" w:w="80"/>
-              <w:right w:type="dxa" w:w="120"/>
-            </w:tcMar>
-          </w:tcPr>
-          <w:p>
-            <w:pPr>
-              <w:jc w:val="center"/>
-            </w:pPr>
-            <w:r>
-              <w:rPr>
-                <w:rFonts w:ascii="맑은 고딕" w:cs="맑은 고딕" w:eastAsia="맑은 고딕" w:hAnsi="맑은 고딕"/>
-                <w:b w:val="false"/>
-                <w:bCs w:val="false"/>
-                <w:sz w:val="18"/>
-                <w:szCs w:val="18"/>
-              </w:rPr>
-              <w:t xml:space="preserve">본로이 PM</w:t>
-            </w:r>
-          </w:p>
-        </w:tc>
-        <w:tc>
-          <w:tcPr>
-            <w:tcW w:type="dxa" w:w="1000"/>
-            <w:tcBorders>
-              <w:top w:val="single" w:color="CCCCCC" w:sz="1"/>
-              <w:left w:val="single" w:color="CCCCCC" w:sz="1"/>
-              <w:bottom w:val="single" w:color="CCCCCC" w:sz="1"/>
-              <w:right w:val="single" w:color="CCCCCC" w:sz="1"/>
-            </w:tcBorders>
-            <w:shd w:fill="E8F5E9" w:val="clear"/>
-            <w:tcMar>
-              <w:top w:type="dxa" w:w="80"/>
-              <w:left w:type="dxa" w:w="120"/>
-              <w:bottom w:type="dxa" w:w="80"/>
-              <w:right w:type="dxa" w:w="120"/>
-            </w:tcMar>
-          </w:tcPr>
-          <w:p>
-            <w:pPr>
-              <w:jc w:val="center"/>
-            </w:pPr>
-            <w:r>
-              <w:rPr>
-                <w:rFonts w:ascii="맑은 고딕" w:cs="맑은 고딕" w:eastAsia="맑은 고딕" w:hAnsi="맑은 고딕"/>
-                <w:sz w:val="18"/>
-                <w:szCs w:val="18"/>
-              </w:rPr>
-              <w:t xml:space="preserve">작성 완료</w:t>
-            </w:r>
-          </w:p>
-        </w:tc>
-        <w:tc>
-          <w:tcPr>
-            <w:tcW w:type="dxa" w:w="2506"/>
-            <w:tcBorders>
-              <w:top w:val="single" w:color="CCCCCC" w:sz="1"/>
-              <w:left w:val="single" w:color="CCCCCC" w:sz="1"/>
-              <w:bottom w:val="single" w:color="CCCCCC" w:sz="1"/>
-              <w:right w:val="single" w:color="CCCCCC" w:sz="1"/>
-            </w:tcBorders>
-            <w:shd w:fill="FFFFFF" w:val="clear"/>
-            <w:tcMar>
-              <w:top w:type="dxa" w:w="80"/>
-              <w:left w:type="dxa" w:w="120"/>
-              <w:bottom w:type="dxa" w:w="80"/>
-              <w:right w:type="dxa" w:w="120"/>
-            </w:tcMar>
-          </w:tcPr>
-          <w:p>
-            <w:pPr>
-              <w:jc w:val="left"/>
-            </w:pPr>
-            <w:r>
-              <w:rPr>
-                <w:rFonts w:ascii="맑은 고딕" w:cs="맑은 고딕" w:eastAsia="맑은 고딕" w:hAnsi="맑은 고딕"/>
-                <w:b w:val="false"/>
-                <w:bCs w:val="false"/>
-                <w:sz w:val="18"/>
-                <w:szCs w:val="18"/>
-              </w:rPr>
-              <w:t xml:space="preserve">어드민 대시보드, 환자관리, 보안대응, 백업·복구 매뉴얼 (~18p)</w:t>
-            </w:r>
-          </w:p>
-        </w:tc>
-      </w:tr>
-      <w:tr>
-        <w:tc>
-          <w:tcPr>
-            <w:tcW w:type="dxa" w:w="400"/>
-            <w:tcBorders>
-              <w:top w:val="single" w:color="CCCCCC" w:sz="1"/>
-              <w:left w:val="single" w:color="CCCCCC" w:sz="1"/>
-              <w:bottom w:val="single" w:color="CCCCCC" w:sz="1"/>
-              <w:right w:val="single" w:color="CCCCCC" w:sz="1"/>
-            </w:tcBorders>
-            <w:shd w:fill="FFFFFF" w:val="clear"/>
-            <w:tcMar>
-              <w:top w:type="dxa" w:w="80"/>
-              <w:left w:type="dxa" w:w="120"/>
-              <w:bottom w:type="dxa" w:w="80"/>
-              <w:right w:type="dxa" w:w="120"/>
-            </w:tcMar>
-          </w:tcPr>
-          <w:p>
-            <w:r/>
-            <w:r>
-              <w:rPr>
-                <w:rFonts w:ascii="맑은 고딕" w:hAnsi="맑은 고딕"/>
-                <w:b/>
-                <w:sz w:val="18"/>
-                <w:rFonts w:eastAsia="맑은 고딕"/>
-              </w:rPr>
-              <w:t>B-05</w:t>
-            </w:r>
-          </w:p>
-        </w:tc>
-        <w:tc>
-          <w:tcPr>
-            <w:tcW w:type="dxa" w:w="2200"/>
-            <w:tcBorders>
-              <w:top w:val="single" w:color="CCCCCC" w:sz="1"/>
-              <w:left w:val="single" w:color="CCCCCC" w:sz="1"/>
-              <w:bottom w:val="single" w:color="CCCCCC" w:sz="1"/>
-              <w:right w:val="single" w:color="CCCCCC" w:sz="1"/>
-            </w:tcBorders>
-            <w:shd w:fill="FFFFFF" w:val="clear"/>
-            <w:tcMar>
-              <w:top w:type="dxa" w:w="80"/>
-              <w:left w:type="dxa" w:w="120"/>
-              <w:bottom w:type="dxa" w:w="80"/>
-              <w:right w:type="dxa" w:w="120"/>
-            </w:tcMar>
-          </w:tcPr>
-          <w:p>
-            <w:pPr>
-              <w:jc w:val="left"/>
-            </w:pPr>
-            <w:r>
-              <w:rPr>
-                <w:rFonts w:ascii="맑은 고딕" w:cs="맑은 고딕" w:eastAsia="맑은 고딕" w:hAnsi="맑은 고딕"/>
-                <w:b w:val="false"/>
-                <w:bCs w:val="false"/>
-                <w:sz w:val="18"/>
-                <w:szCs w:val="18"/>
-              </w:rPr>
-              <w:t xml:space="preserve">08_테스트결과서.docx</w:t>
-            </w:r>
-          </w:p>
-        </w:tc>
-        <w:tc>
-          <w:tcPr>
-            <w:tcW w:type="dxa" w:w="1200"/>
-            <w:tcBorders>
-              <w:top w:val="single" w:color="CCCCCC" w:sz="1"/>
-              <w:left w:val="single" w:color="CCCCCC" w:sz="1"/>
-              <w:bottom w:val="single" w:color="CCCCCC" w:sz="1"/>
-              <w:right w:val="single" w:color="CCCCCC" w:sz="1"/>
-            </w:tcBorders>
-            <w:shd w:fill="FFFFFF" w:val="clear"/>
-            <w:tcMar>
-              <w:top w:type="dxa" w:w="80"/>
-              <w:left w:type="dxa" w:w="120"/>
-              <w:bottom w:type="dxa" w:w="80"/>
-              <w:right w:type="dxa" w:w="120"/>
-            </w:tcMar>
-          </w:tcPr>
-          <w:p>
-            <w:pPr>
-              <w:jc w:val="center"/>
-            </w:pPr>
-            <w:r>
-              <w:rPr>
-                <w:rFonts w:ascii="맑은 고딕" w:cs="맑은 고딕" w:eastAsia="맑은 고딕" w:hAnsi="맑은 고딕"/>
-                <w:b w:val="false"/>
-                <w:bCs w:val="false"/>
-                <w:sz w:val="18"/>
-                <w:szCs w:val="18"/>
-              </w:rPr>
-              <w:t>2026-08-19</w:t>
-            </w:r>
-          </w:p>
-        </w:tc>
-        <w:tc>
-          <w:tcPr>
-            <w:tcW w:type="dxa" w:w="1200"/>
-            <w:tcBorders>
-              <w:top w:val="single" w:color="CCCCCC" w:sz="1"/>
-              <w:left w:val="single" w:color="CCCCCC" w:sz="1"/>
-              <w:bottom w:val="single" w:color="CCCCCC" w:sz="1"/>
-              <w:right w:val="single" w:color="CCCCCC" w:sz="1"/>
-            </w:tcBorders>
-            <w:shd w:fill="FFFFFF" w:val="clear"/>
-            <w:tcMar>
-              <w:top w:type="dxa" w:w="80"/>
-              <w:left w:type="dxa" w:w="120"/>
-              <w:bottom w:type="dxa" w:w="80"/>
-              <w:right w:type="dxa" w:w="120"/>
-            </w:tcMar>
-          </w:tcPr>
-          <w:p>
-            <w:pPr>
-              <w:jc w:val="center"/>
-            </w:pPr>
-            <w:r>
-              <w:rPr>
-                <w:rFonts w:ascii="맑은 고딕" w:cs="맑은 고딕" w:eastAsia="맑은 고딕" w:hAnsi="맑은 고딕"/>
-                <w:b w:val="false"/>
-                <w:bCs w:val="false"/>
-                <w:sz w:val="18"/>
-                <w:szCs w:val="18"/>
-              </w:rPr>
-              <w:t xml:space="preserve">본로이 PM</w:t>
-            </w:r>
-          </w:p>
-        </w:tc>
-        <w:tc>
-          <w:tcPr>
-            <w:tcW w:type="dxa" w:w="1000"/>
-            <w:tcBorders>
-              <w:top w:val="single" w:color="CCCCCC" w:sz="1"/>
-              <w:left w:val="single" w:color="CCCCCC" w:sz="1"/>
-              <w:bottom w:val="single" w:color="CCCCCC" w:sz="1"/>
-              <w:right w:val="single" w:color="CCCCCC" w:sz="1"/>
-            </w:tcBorders>
-            <w:shd w:fill="E8F5E9" w:val="clear"/>
-            <w:tcMar>
-              <w:top w:type="dxa" w:w="80"/>
-              <w:left w:type="dxa" w:w="120"/>
-              <w:bottom w:type="dxa" w:w="80"/>
-              <w:right w:type="dxa" w:w="120"/>
-            </w:tcMar>
-          </w:tcPr>
-          <w:p>
-            <w:pPr>
-              <w:jc w:val="center"/>
-            </w:pPr>
-            <w:r>
-              <w:rPr>
-                <w:rFonts w:ascii="맑은 고딕" w:cs="맑은 고딕" w:eastAsia="맑은 고딕" w:hAnsi="맑은 고딕"/>
-                <w:sz w:val="18"/>
-                <w:szCs w:val="18"/>
-              </w:rPr>
-              <w:t xml:space="preserve">작성 완료</w:t>
-            </w:r>
-          </w:p>
-        </w:tc>
-        <w:tc>
-          <w:tcPr>
-            <w:tcW w:type="dxa" w:w="2506"/>
-            <w:tcBorders>
-              <w:top w:val="single" w:color="CCCCCC" w:sz="1"/>
-              <w:left w:val="single" w:color="CCCCCC" w:sz="1"/>
-              <w:bottom w:val="single" w:color="CCCCCC" w:sz="1"/>
-              <w:right w:val="single" w:color="CCCCCC" w:sz="1"/>
-            </w:tcBorders>
-            <w:shd w:fill="FFFFFF" w:val="clear"/>
-            <w:tcMar>
-              <w:top w:type="dxa" w:w="80"/>
-              <w:left w:type="dxa" w:w="120"/>
-              <w:bottom w:type="dxa" w:w="80"/>
-              <w:right w:type="dxa" w:w="120"/>
-            </w:tcMar>
-          </w:tcPr>
-          <w:p>
-            <w:pPr>
-              <w:jc w:val="left"/>
-            </w:pPr>
-            <w:r>
-              <w:rPr>
-                <w:rFonts w:ascii="맑은 고딕" w:cs="맑은 고딕" w:eastAsia="맑은 고딕" w:hAnsi="맑은 고딕"/>
-                <w:b w:val="false"/>
-                <w:bCs w:val="false"/>
-                <w:sz w:val="18"/>
-                <w:szCs w:val="18"/>
-              </w:rPr>
-              <w:t xml:space="preserve">테스트 전략, E2E 케이스 목록, 보안 회귀 테스트, 성능 측정 (~12p)</w:t>
-            </w:r>
-          </w:p>
-        </w:tc>
-      </w:tr>
-      <w:tr>
-        <w:tc>
-          <w:tcPr>
-            <w:tcW w:type="dxa" w:w="400"/>
-            <w:tcBorders>
-              <w:top w:val="single" w:color="CCCCCC" w:sz="1"/>
-              <w:left w:val="single" w:color="CCCCCC" w:sz="1"/>
-              <w:bottom w:val="single" w:color="CCCCCC" w:sz="1"/>
-              <w:right w:val="single" w:color="CCCCCC" w:sz="1"/>
-            </w:tcBorders>
-            <w:shd w:fill="FFFFFF" w:val="clear"/>
-            <w:tcMar>
-              <w:top w:type="dxa" w:w="80"/>
-              <w:left w:type="dxa" w:w="120"/>
-              <w:bottom w:type="dxa" w:w="80"/>
-              <w:right w:type="dxa" w:w="120"/>
-            </w:tcMar>
-          </w:tcPr>
-          <w:p>
-            <w:r/>
-            <w:r>
-              <w:rPr>
-                <w:rFonts w:ascii="맑은 고딕" w:hAnsi="맑은 고딕"/>
-                <w:b/>
-                <w:sz w:val="18"/>
-                <w:rFonts w:eastAsia="맑은 고딕"/>
-              </w:rPr>
-              <w:t>B-06</w:t>
             </w:r>
           </w:p>
         </w:tc>
@@ -4539,278 +4149,6 @@
                 <w:szCs w:val="18"/>
               </w:rPr>
               <w:t xml:space="preserve">KHIDI 형식 확인 필요 [진행 중]</w:t>
-            </w:r>
-          </w:p>
-        </w:tc>
-      </w:tr>
-      <w:tr>
-        <w:tc>
-          <w:tcPr>
-            <w:tcW w:type="dxa" w:w="1200"/>
-            <w:tcBorders>
-              <w:top w:val="single" w:color="CCCCCC" w:sz="1"/>
-              <w:left w:val="single" w:color="CCCCCC" w:sz="1"/>
-              <w:bottom w:val="single" w:color="CCCCCC" w:sz="1"/>
-              <w:right w:val="single" w:color="CCCCCC" w:sz="1"/>
-            </w:tcBorders>
-            <w:shd w:fill="F5F5F5" w:val="clear"/>
-            <w:tcMar>
-              <w:top w:type="dxa" w:w="80"/>
-              <w:left w:type="dxa" w:w="120"/>
-              <w:bottom w:type="dxa" w:w="80"/>
-              <w:right w:type="dxa" w:w="120"/>
-            </w:tcMar>
-          </w:tcPr>
-          <w:p>
-            <w:pPr>
-              <w:jc w:val="left"/>
-            </w:pPr>
-            <w:r>
-              <w:rPr>
-                <w:rFonts w:ascii="맑은 고딕" w:cs="맑은 고딕" w:eastAsia="맑은 고딕" w:hAnsi="맑은 고딕"/>
-                <w:b w:val="false"/>
-                <w:bCs w:val="false"/>
-                <w:sz w:val="18"/>
-                <w:szCs w:val="18"/>
-              </w:rPr>
-              <w:t xml:space="preserve">2026년 8월</w:t>
-            </w:r>
-          </w:p>
-        </w:tc>
-        <w:tc>
-          <w:tcPr>
-            <w:tcW w:type="dxa" w:w="1800"/>
-            <w:tcBorders>
-              <w:top w:val="single" w:color="CCCCCC" w:sz="1"/>
-              <w:left w:val="single" w:color="CCCCCC" w:sz="1"/>
-              <w:bottom w:val="single" w:color="CCCCCC" w:sz="1"/>
-              <w:right w:val="single" w:color="CCCCCC" w:sz="1"/>
-            </w:tcBorders>
-            <w:shd w:fill="FFFFFF" w:val="clear"/>
-            <w:tcMar>
-              <w:top w:type="dxa" w:w="80"/>
-              <w:left w:type="dxa" w:w="120"/>
-              <w:bottom w:type="dxa" w:w="80"/>
-              <w:right w:type="dxa" w:w="120"/>
-            </w:tcMar>
-          </w:tcPr>
-          <w:p>
-            <w:pPr>
-              <w:jc w:val="left"/>
-            </w:pPr>
-            <w:r>
-              <w:rPr>
-                <w:rFonts w:ascii="맑은 고딕" w:cs="맑은 고딕" w:eastAsia="맑은 고딕" w:hAnsi="맑은 고딕"/>
-                <w:b/>
-                <w:bCs/>
-                <w:sz w:val="18"/>
-                <w:szCs w:val="18"/>
-              </w:rPr>
-              <w:t xml:space="preserve">중간보고</w:t>
-            </w:r>
-          </w:p>
-        </w:tc>
-        <w:tc>
-          <w:tcPr>
-            <w:tcW w:type="dxa" w:w="2500"/>
-            <w:tcBorders>
-              <w:top w:val="single" w:color="CCCCCC" w:sz="1"/>
-              <w:left w:val="single" w:color="CCCCCC" w:sz="1"/>
-              <w:bottom w:val="single" w:color="CCCCCC" w:sz="1"/>
-              <w:right w:val="single" w:color="CCCCCC" w:sz="1"/>
-            </w:tcBorders>
-            <w:shd w:fill="FFFFFF" w:val="clear"/>
-            <w:tcMar>
-              <w:top w:type="dxa" w:w="80"/>
-              <w:left w:type="dxa" w:w="120"/>
-              <w:bottom w:type="dxa" w:w="80"/>
-              <w:right w:type="dxa" w:w="120"/>
-            </w:tcMar>
-          </w:tcPr>
-          <w:p>
-            <w:pPr>
-              <w:jc w:val="left"/>
-            </w:pPr>
-            <w:r>
-              <w:rPr>
-                <w:rFonts w:ascii="맑은 고딕" w:cs="맑은 고딕" w:eastAsia="맑은 고딕" w:hAnsi="맑은 고딕"/>
-                <w:b w:val="false"/>
-                <w:bCs w:val="false"/>
-                <w:sz w:val="18"/>
-                <w:szCs w:val="18"/>
-              </w:rPr>
-              <w:t xml:space="preserve">04_중간보고서.docx (갱신본)</w:t>
-            </w:r>
-          </w:p>
-        </w:tc>
-        <w:tc>
-          <w:tcPr>
-            <w:tcW w:type="dxa" w:w="3006"/>
-            <w:tcBorders>
-              <w:top w:val="single" w:color="CCCCCC" w:sz="1"/>
-              <w:left w:val="single" w:color="CCCCCC" w:sz="1"/>
-              <w:bottom w:val="single" w:color="CCCCCC" w:sz="1"/>
-              <w:right w:val="single" w:color="CCCCCC" w:sz="1"/>
-            </w:tcBorders>
-            <w:shd w:fill="FFF9C4" w:val="clear"/>
-            <w:tcMar>
-              <w:top w:type="dxa" w:w="80"/>
-              <w:left w:type="dxa" w:w="120"/>
-              <w:bottom w:type="dxa" w:w="80"/>
-              <w:right w:type="dxa" w:w="120"/>
-            </w:tcMar>
-          </w:tcPr>
-          <w:p>
-            <w:pPr>
-              <w:jc w:val="left"/>
-            </w:pPr>
-            <w:r>
-              <w:rPr>
-                <w:rFonts w:ascii="맑은 고딕" w:cs="맑은 고딕" w:eastAsia="맑은 고딕" w:hAnsi="맑은 고딕"/>
-                <w:b w:val="false"/>
-                <w:bCs w:val="false"/>
-                <w:sz w:val="18"/>
-                <w:szCs w:val="18"/>
-              </w:rPr>
-              <w:t xml:space="preserve">KPI 중간 달성률 포함, 8월 제출 예정</w:t>
-            </w:r>
-          </w:p>
-        </w:tc>
-      </w:tr>
-      <w:tr>
-        <w:tc>
-          <w:tcPr>
-            <w:tcW w:type="dxa" w:w="1200"/>
-            <w:tcBorders>
-              <w:top w:val="single" w:color="CCCCCC" w:sz="1"/>
-              <w:left w:val="single" w:color="CCCCCC" w:sz="1"/>
-              <w:bottom w:val="single" w:color="CCCCCC" w:sz="1"/>
-              <w:right w:val="single" w:color="CCCCCC" w:sz="1"/>
-            </w:tcBorders>
-            <w:shd w:fill="F5F5F5" w:val="clear"/>
-            <w:tcMar>
-              <w:top w:type="dxa" w:w="80"/>
-              <w:left w:type="dxa" w:w="120"/>
-              <w:bottom w:type="dxa" w:w="80"/>
-              <w:right w:type="dxa" w:w="120"/>
-            </w:tcMar>
-          </w:tcPr>
-          <w:p>
-            <w:pPr>
-              <w:jc w:val="left"/>
-            </w:pPr>
-            <w:r>
-              <w:rPr>
-                <w:rFonts w:ascii="맑은 고딕" w:cs="맑은 고딕" w:eastAsia="맑은 고딕" w:hAnsi="맑은 고딕"/>
-                <w:b w:val="false"/>
-                <w:bCs w:val="false"/>
-                <w:sz w:val="18"/>
-                <w:szCs w:val="18"/>
-              </w:rPr>
-              <w:t xml:space="preserve">2026년 11월</w:t>
-            </w:r>
-          </w:p>
-        </w:tc>
-        <w:tc>
-          <w:tcPr>
-            <w:tcW w:type="dxa" w:w="1800"/>
-            <w:tcBorders>
-              <w:top w:val="single" w:color="CCCCCC" w:sz="1"/>
-              <w:left w:val="single" w:color="CCCCCC" w:sz="1"/>
-              <w:bottom w:val="single" w:color="CCCCCC" w:sz="1"/>
-              <w:right w:val="single" w:color="CCCCCC" w:sz="1"/>
-            </w:tcBorders>
-            <w:shd w:fill="FFFFFF" w:val="clear"/>
-            <w:tcMar>
-              <w:top w:type="dxa" w:w="80"/>
-              <w:left w:type="dxa" w:w="120"/>
-              <w:bottom w:type="dxa" w:w="80"/>
-              <w:right w:type="dxa" w:w="120"/>
-            </w:tcMar>
-          </w:tcPr>
-          <w:p>
-            <w:pPr>
-              <w:jc w:val="left"/>
-            </w:pPr>
-            <w:r>
-              <w:rPr>
-                <w:rFonts w:ascii="맑은 고딕" w:cs="맑은 고딕" w:eastAsia="맑은 고딕" w:hAnsi="맑은 고딕"/>
-                <w:b/>
-                <w:bCs/>
-                <w:sz w:val="18"/>
-                <w:szCs w:val="18"/>
-              </w:rPr>
-              <w:t xml:space="preserve">최종보고</w:t>
-            </w:r>
-          </w:p>
-        </w:tc>
-        <w:tc>
-          <w:tcPr>
-            <w:tcW w:type="dxa" w:w="2500"/>
-            <w:tcBorders>
-              <w:top w:val="single" w:color="CCCCCC" w:sz="1"/>
-              <w:left w:val="single" w:color="CCCCCC" w:sz="1"/>
-              <w:bottom w:val="single" w:color="CCCCCC" w:sz="1"/>
-              <w:right w:val="single" w:color="CCCCCC" w:sz="1"/>
-            </w:tcBorders>
-            <w:shd w:fill="FFFFFF" w:val="clear"/>
-            <w:tcMar>
-              <w:top w:type="dxa" w:w="80"/>
-              <w:left w:type="dxa" w:w="120"/>
-              <w:bottom w:type="dxa" w:w="80"/>
-              <w:right w:type="dxa" w:w="120"/>
-            </w:tcMar>
-          </w:tcPr>
-          <w:p>
-            <w:pPr>
-              <w:jc w:val="left"/>
-            </w:pPr>
-            <w:r>
-              <w:rPr>
-                <w:rFonts w:ascii="맑은 고딕" w:cs="맑은 고딕" w:eastAsia="맑은 고딕" w:hAnsi="맑은 고딕"/>
-                <w:b w:val="false"/>
-                <w:bCs w:val="false"/>
-                <w:sz w:val="18"/>
-                <w:szCs w:val="18"/>
-              </w:rPr>
-              <w:t xml:space="preserve">05_최종보고서.docx
-06_사용자매뉴얼.docx
-07_관리자매뉴얼.docx
-08_테스트결과서.docx
-09_산출물목록.docx</w:t>
-            </w:r>
-          </w:p>
-        </w:tc>
-        <w:tc>
-          <w:tcPr>
-            <w:tcW w:type="dxa" w:w="3006"/>
-            <w:tcBorders>
-              <w:top w:val="single" w:color="CCCCCC" w:sz="1"/>
-              <w:left w:val="single" w:color="CCCCCC" w:sz="1"/>
-              <w:bottom w:val="single" w:color="CCCCCC" w:sz="1"/>
-              <w:right w:val="single" w:color="CCCCCC" w:sz="1"/>
-            </w:tcBorders>
-            <w:shd w:fill="FFF9C4" w:val="clear"/>
-            <w:tcMar>
-              <w:top w:type="dxa" w:w="80"/>
-              <w:left w:type="dxa" w:w="120"/>
-              <w:bottom w:type="dxa" w:w="80"/>
-              <w:right w:type="dxa" w:w="120"/>
-            </w:tcMar>
-          </w:tcPr>
-          <w:p>
-            <w:pPr>
-              <w:jc w:val="left"/>
-            </w:pPr>
-            <w:r>
-              <w:rPr>
-                <w:rFonts w:ascii="맑은 고딕" w:cs="맑은 고딕" w:eastAsia="맑은 고딕" w:hAnsi="맑은 고딕"/>
-                <w:b w:val="false"/>
-                <w:bCs w:val="false"/>
-                <w:sz w:val="18"/>
-                <w:szCs w:val="18"/>
-              </w:rPr>
-              <w:t xml:space="preserve">최종보고회 개최 후 전체 산출물 패키지 제출, 11월 예정</w:t>
             </w:r>
           </w:p>
         </w:tc>

</xml_diff>

<commit_message>
chore: 작업 자동 저장 (2026-08-20 16:06)
</commit_message>
<xml_diff>
--- a/docs/government-project/09_산출물목록.docx
+++ b/docs/government-project/09_산출물목록.docx
@@ -4149,6 +4149,282 @@
                 <w:szCs w:val="18"/>
               </w:rPr>
               <w:t xml:space="preserve">KHIDI 형식 확인 필요 [진행 중]</w:t>
+            </w:r>
+          </w:p>
+        </w:tc>
+      </w:tr>
+      <w:tr>
+        <w:tc>
+          <w:tcPr>
+            <w:tcW w:type="dxa" w:w="1200"/>
+            <w:tcBorders>
+              <w:top w:val="single" w:color="CCCCCC" w:sz="1"/>
+              <w:left w:val="single" w:color="CCCCCC" w:sz="1"/>
+              <w:bottom w:val="single" w:color="CCCCCC" w:sz="1"/>
+              <w:right w:val="single" w:color="CCCCCC" w:sz="1"/>
+            </w:tcBorders>
+            <w:shd w:fill="F5F5F5" w:val="clear"/>
+            <w:tcMar>
+              <w:top w:type="dxa" w:w="80"/>
+              <w:left w:type="dxa" w:w="120"/>
+              <w:bottom w:type="dxa" w:w="80"/>
+              <w:right w:type="dxa" w:w="120"/>
+            </w:tcMar>
+          </w:tcPr>
+          <w:p>
+            <w:pPr>
+              <w:jc w:val="left"/>
+            </w:pPr>
+            <w:r>
+              <w:rPr>
+                <w:rFonts w:ascii="맑은 고딕" w:cs="맑은 고딕" w:eastAsia="맑은 고딕" w:hAnsi="맑은 고딕"/>
+                <w:b w:val="false"/>
+                <w:bCs w:val="false"/>
+                <w:sz w:val="18"/>
+                <w:szCs w:val="18"/>
+              </w:rPr>
+              <w:t xml:space="preserve">2026년 8월</w:t>
+            </w:r>
+          </w:p>
+        </w:tc>
+        <w:tc>
+          <w:tcPr>
+            <w:tcW w:type="dxa" w:w="1800"/>
+            <w:tcBorders>
+              <w:top w:val="single" w:color="CCCCCC" w:sz="1"/>
+              <w:left w:val="single" w:color="CCCCCC" w:sz="1"/>
+              <w:bottom w:val="single" w:color="CCCCCC" w:sz="1"/>
+              <w:right w:val="single" w:color="CCCCCC" w:sz="1"/>
+            </w:tcBorders>
+            <w:shd w:fill="FFFFFF" w:val="clear"/>
+            <w:tcMar>
+              <w:top w:type="dxa" w:w="80"/>
+              <w:left w:type="dxa" w:w="120"/>
+              <w:bottom w:type="dxa" w:w="80"/>
+              <w:right w:type="dxa" w:w="120"/>
+            </w:tcMar>
+          </w:tcPr>
+          <w:p>
+            <w:pPr>
+              <w:jc w:val="left"/>
+            </w:pPr>
+            <w:r>
+              <w:rPr>
+                <w:rFonts w:ascii="맑은 고딕" w:cs="맑은 고딕" w:eastAsia="맑은 고딕" w:hAnsi="맑은 고딕"/>
+                <w:b/>
+                <w:bCs/>
+                <w:sz w:val="18"/>
+                <w:szCs w:val="18"/>
+              </w:rPr>
+              <w:t xml:space="preserve">중간보고</w:t>
+            </w:r>
+          </w:p>
+        </w:tc>
+        <w:tc>
+          <w:tcPr>
+            <w:tcW w:type="dxa" w:w="2500"/>
+            <w:tcBorders>
+              <w:top w:val="single" w:color="CCCCCC" w:sz="1"/>
+              <w:left w:val="single" w:color="CCCCCC" w:sz="1"/>
+              <w:bottom w:val="single" w:color="CCCCCC" w:sz="1"/>
+              <w:right w:val="single" w:color="CCCCCC" w:sz="1"/>
+            </w:tcBorders>
+            <w:shd w:fill="FFFFFF" w:val="clear"/>
+            <w:tcMar>
+              <w:top w:type="dxa" w:w="80"/>
+              <w:left w:type="dxa" w:w="120"/>
+              <w:bottom w:type="dxa" w:w="80"/>
+              <w:right w:type="dxa" w:w="120"/>
+            </w:tcMar>
+          </w:tcPr>
+          <w:p>
+            <w:pPr>
+              <w:jc w:val="left"/>
+            </w:pPr>
+            <w:r>
+              <w:rPr>
+                <w:rFonts w:ascii="맑은 고딕" w:cs="맑은 고딕" w:eastAsia="맑은 고딕" w:hAnsi="맑은 고딕"/>
+                <w:b w:val="false"/>
+                <w:bCs w:val="false"/>
+                <w:sz w:val="18"/>
+                <w:szCs w:val="18"/>
+              </w:rPr>
+              <w:t>중간보고서 (KHIDI 지정 양식, 별도 관리)</w:t>
+            </w:r>
+          </w:p>
+        </w:tc>
+        <w:tc>
+          <w:tcPr>
+            <w:tcW w:type="dxa" w:w="3006"/>
+            <w:tcBorders>
+              <w:top w:val="single" w:color="CCCCCC" w:sz="1"/>
+              <w:left w:val="single" w:color="CCCCCC" w:sz="1"/>
+              <w:bottom w:val="single" w:color="CCCCCC" w:sz="1"/>
+              <w:right w:val="single" w:color="CCCCCC" w:sz="1"/>
+            </w:tcBorders>
+            <w:shd w:fill="FFF9C4" w:val="clear"/>
+            <w:tcMar>
+              <w:top w:type="dxa" w:w="80"/>
+              <w:left w:type="dxa" w:w="120"/>
+              <w:bottom w:type="dxa" w:w="80"/>
+              <w:right w:type="dxa" w:w="120"/>
+            </w:tcMar>
+          </w:tcPr>
+          <w:p>
+            <w:pPr>
+              <w:jc w:val="left"/>
+            </w:pPr>
+            <w:r>
+              <w:rPr>
+                <w:rFonts w:ascii="맑은 고딕" w:cs="맑은 고딕" w:eastAsia="맑은 고딕" w:hAnsi="맑은 고딕"/>
+                <w:b w:val="false"/>
+                <w:bCs w:val="false"/>
+                <w:sz w:val="18"/>
+                <w:szCs w:val="18"/>
+              </w:rPr>
+              <w:t xml:space="preserve">KPI 중간 달성률 포함, 8월 제출 예정</w:t>
+            </w:r>
+          </w:p>
+        </w:tc>
+      </w:tr>
+      <w:tr>
+        <w:tc>
+          <w:tcPr>
+            <w:tcW w:type="dxa" w:w="1200"/>
+            <w:tcBorders>
+              <w:top w:val="single" w:color="CCCCCC" w:sz="1"/>
+              <w:left w:val="single" w:color="CCCCCC" w:sz="1"/>
+              <w:bottom w:val="single" w:color="CCCCCC" w:sz="1"/>
+              <w:right w:val="single" w:color="CCCCCC" w:sz="1"/>
+            </w:tcBorders>
+            <w:shd w:fill="F5F5F5" w:val="clear"/>
+            <w:tcMar>
+              <w:top w:type="dxa" w:w="80"/>
+              <w:left w:type="dxa" w:w="120"/>
+              <w:bottom w:type="dxa" w:w="80"/>
+              <w:right w:type="dxa" w:w="120"/>
+            </w:tcMar>
+          </w:tcPr>
+          <w:p>
+            <w:pPr>
+              <w:jc w:val="left"/>
+            </w:pPr>
+            <w:r>
+              <w:rPr>
+                <w:rFonts w:ascii="맑은 고딕" w:cs="맑은 고딕" w:eastAsia="맑은 고딕" w:hAnsi="맑은 고딕"/>
+                <w:b w:val="false"/>
+                <w:bCs w:val="false"/>
+                <w:sz w:val="18"/>
+                <w:szCs w:val="18"/>
+              </w:rPr>
+              <w:t xml:space="preserve">2026년 11월</w:t>
+            </w:r>
+          </w:p>
+        </w:tc>
+        <w:tc>
+          <w:tcPr>
+            <w:tcW w:type="dxa" w:w="1800"/>
+            <w:tcBorders>
+              <w:top w:val="single" w:color="CCCCCC" w:sz="1"/>
+              <w:left w:val="single" w:color="CCCCCC" w:sz="1"/>
+              <w:bottom w:val="single" w:color="CCCCCC" w:sz="1"/>
+              <w:right w:val="single" w:color="CCCCCC" w:sz="1"/>
+            </w:tcBorders>
+            <w:shd w:fill="FFFFFF" w:val="clear"/>
+            <w:tcMar>
+              <w:top w:type="dxa" w:w="80"/>
+              <w:left w:type="dxa" w:w="120"/>
+              <w:bottom w:type="dxa" w:w="80"/>
+              <w:right w:type="dxa" w:w="120"/>
+            </w:tcMar>
+          </w:tcPr>
+          <w:p>
+            <w:pPr>
+              <w:jc w:val="left"/>
+            </w:pPr>
+            <w:r>
+              <w:rPr>
+                <w:rFonts w:ascii="맑은 고딕" w:cs="맑은 고딕" w:eastAsia="맑은 고딕" w:hAnsi="맑은 고딕"/>
+                <w:b/>
+                <w:bCs/>
+                <w:sz w:val="18"/>
+                <w:szCs w:val="18"/>
+              </w:rPr>
+              <w:t xml:space="preserve">최종보고</w:t>
+            </w:r>
+          </w:p>
+        </w:tc>
+        <w:tc>
+          <w:tcPr>
+            <w:tcW w:type="dxa" w:w="2500"/>
+            <w:tcBorders>
+              <w:top w:val="single" w:color="CCCCCC" w:sz="1"/>
+              <w:left w:val="single" w:color="CCCCCC" w:sz="1"/>
+              <w:bottom w:val="single" w:color="CCCCCC" w:sz="1"/>
+              <w:right w:val="single" w:color="CCCCCC" w:sz="1"/>
+            </w:tcBorders>
+            <w:shd w:fill="FFFFFF" w:val="clear"/>
+            <w:tcMar>
+              <w:top w:type="dxa" w:w="80"/>
+              <w:left w:type="dxa" w:w="120"/>
+              <w:bottom w:type="dxa" w:w="80"/>
+              <w:right w:type="dxa" w:w="120"/>
+            </w:tcMar>
+          </w:tcPr>
+          <w:p>
+            <w:pPr>
+              <w:jc w:val="left"/>
+            </w:pPr>
+            <w:r>
+              <w:rPr>
+                <w:rFonts w:ascii="맑은 고딕" w:cs="맑은 고딕" w:eastAsia="맑은 고딕" w:hAnsi="맑은 고딕"/>
+                <w:b w:val="false"/>
+                <w:bCs w:val="false"/>
+                <w:sz w:val="18"/>
+                <w:szCs w:val="18"/>
+              </w:rPr>
+              <w:t>최종보고서 (KHIDI 지정 양식, 별도 관리)</w:t>
+              <w:br/>
+              <w:t>06_사용자매뉴얼.docx</w:t>
+              <w:br/>
+              <w:t>07_관리자매뉴얼.docx</w:t>
+              <w:br/>
+              <w:t>08_테스트결과서.docx</w:t>
+              <w:br/>
+              <w:t>09_산출물목록.docx</w:t>
+            </w:r>
+          </w:p>
+        </w:tc>
+        <w:tc>
+          <w:tcPr>
+            <w:tcW w:type="dxa" w:w="3006"/>
+            <w:tcBorders>
+              <w:top w:val="single" w:color="CCCCCC" w:sz="1"/>
+              <w:left w:val="single" w:color="CCCCCC" w:sz="1"/>
+              <w:bottom w:val="single" w:color="CCCCCC" w:sz="1"/>
+              <w:right w:val="single" w:color="CCCCCC" w:sz="1"/>
+            </w:tcBorders>
+            <w:shd w:fill="FFF9C4" w:val="clear"/>
+            <w:tcMar>
+              <w:top w:type="dxa" w:w="80"/>
+              <w:left w:type="dxa" w:w="120"/>
+              <w:bottom w:type="dxa" w:w="80"/>
+              <w:right w:type="dxa" w:w="120"/>
+            </w:tcMar>
+          </w:tcPr>
+          <w:p>
+            <w:pPr>
+              <w:jc w:val="left"/>
+            </w:pPr>
+            <w:r>
+              <w:rPr>
+                <w:rFonts w:ascii="맑은 고딕" w:cs="맑은 고딕" w:eastAsia="맑은 고딕" w:hAnsi="맑은 고딕"/>
+                <w:b w:val="false"/>
+                <w:bCs w:val="false"/>
+                <w:sz w:val="18"/>
+                <w:szCs w:val="18"/>
+              </w:rPr>
+              <w:t xml:space="preserve">최종보고회 개최 후 전체 산출물 패키지 제출, 11월 예정</w:t>
             </w:r>
           </w:p>
         </w:tc>

</xml_diff>

<commit_message>
chore: 작업 자동 저장 (2026-08-20 17:00)
</commit_message>
<xml_diff>
--- a/docs/government-project/09_산출물목록.docx
+++ b/docs/government-project/09_산출물목록.docx
@@ -5726,6 +5726,619 @@
                 <w:szCs w:val="18"/>
               </w:rPr>
               <w:t xml:space="preserve">내부 기밀</w:t>
+            </w:r>
+          </w:p>
+        </w:tc>
+      </w:tr>
+    </w:tbl>
+    <w:p>
+      <w:r>
+        <w:br w:type="page"/>
+      </w:r>
+    </w:p>
+    <w:p>
+      <w:r>
+        <w:rPr>
+          <w:rFonts w:ascii="맑은 고딕" w:hAnsi="맑은 고딕"/>
+          <w:b/>
+          <w:color w:val="00467F"/>
+          <w:sz w:val="28"/>
+          <w:rFonts w:eastAsia="맑은 고딕"/>
+        </w:rPr>
+        <w:t>사업계획서 약속 대비표</w:t>
+      </w:r>
+    </w:p>
+    <w:p>
+      <w:r>
+        <w:rPr>
+          <w:rFonts w:ascii="맑은 고딕" w:hAnsi="맑은 고딕"/>
+          <w:b w:val="0"/>
+          <w:sz w:val="18"/>
+          <w:rFonts w:eastAsia="맑은 고딕"/>
+        </w:rPr>
+        <w:t>2026. 5. 14. 제출한 사업계획서가 결과물로 적은 항목과 실제 산출물을 나란히 둔 표다. 계획서 표현과 파일 이름이 다른 곳이 있어 함께 적는다.</w:t>
+      </w:r>
+    </w:p>
+    <w:tbl>
+      <w:tblPr>
+        <w:tblW w:type="auto" w:w="0"/>
+        <w:tblLook w:firstColumn="1" w:firstRow="1" w:lastColumn="0" w:lastRow="0" w:noHBand="0" w:noVBand="1" w:val="04A0"/>
+        <w:tblBorders>
+          <w:top w:val="single" w:sz="4" w:color="999999"/>
+          <w:left w:val="single" w:sz="4" w:color="999999"/>
+          <w:bottom w:val="single" w:sz="4" w:color="999999"/>
+          <w:right w:val="single" w:sz="4" w:color="999999"/>
+          <w:insideH w:val="single" w:sz="4" w:color="999999"/>
+          <w:insideV w:val="single" w:sz="4" w:color="999999"/>
+        </w:tblBorders>
+      </w:tblPr>
+      <w:tblGrid>
+        <w:gridCol w:w="2166"/>
+        <w:gridCol w:w="2166"/>
+        <w:gridCol w:w="2166"/>
+        <w:gridCol w:w="2166"/>
+      </w:tblGrid>
+      <w:tr>
+        <w:tc>
+          <w:tcPr>
+            <w:tcW w:type="dxa" w:w="2166"/>
+            <w:shd w:val="clear" w:color="auto" w:fill="00467F"/>
+          </w:tcPr>
+          <w:p>
+            <w:r/>
+            <w:r>
+              <w:rPr>
+                <w:rFonts w:ascii="맑은 고딕" w:hAnsi="맑은 고딕"/>
+                <w:b/>
+                <w:color w:val="FFFFFF"/>
+                <w:sz w:val="18"/>
+                <w:rFonts w:eastAsia="맑은 고딕"/>
+              </w:rPr>
+              <w:t>마일스톤</w:t>
+            </w:r>
+          </w:p>
+        </w:tc>
+        <w:tc>
+          <w:tcPr>
+            <w:tcW w:type="dxa" w:w="2166"/>
+            <w:shd w:val="clear" w:color="auto" w:fill="00467F"/>
+          </w:tcPr>
+          <w:p>
+            <w:r/>
+            <w:r>
+              <w:rPr>
+                <w:rFonts w:ascii="맑은 고딕" w:hAnsi="맑은 고딕"/>
+                <w:b/>
+                <w:color w:val="FFFFFF"/>
+                <w:sz w:val="18"/>
+                <w:rFonts w:eastAsia="맑은 고딕"/>
+              </w:rPr>
+              <w:t>계획서가 적은 결과물</w:t>
+            </w:r>
+          </w:p>
+        </w:tc>
+        <w:tc>
+          <w:tcPr>
+            <w:tcW w:type="dxa" w:w="2166"/>
+            <w:shd w:val="clear" w:color="auto" w:fill="00467F"/>
+          </w:tcPr>
+          <w:p>
+            <w:r/>
+            <w:r>
+              <w:rPr>
+                <w:rFonts w:ascii="맑은 고딕" w:hAnsi="맑은 고딕"/>
+                <w:b/>
+                <w:color w:val="FFFFFF"/>
+                <w:sz w:val="18"/>
+                <w:rFonts w:eastAsia="맑은 고딕"/>
+              </w:rPr>
+              <w:t>실제 산출물</w:t>
+            </w:r>
+          </w:p>
+        </w:tc>
+        <w:tc>
+          <w:tcPr>
+            <w:tcW w:type="dxa" w:w="2166"/>
+            <w:shd w:val="clear" w:color="auto" w:fill="00467F"/>
+          </w:tcPr>
+          <w:p>
+            <w:r/>
+            <w:r>
+              <w:rPr>
+                <w:rFonts w:ascii="맑은 고딕" w:hAnsi="맑은 고딕"/>
+                <w:b/>
+                <w:color w:val="FFFFFF"/>
+                <w:sz w:val="18"/>
+                <w:rFonts w:eastAsia="맑은 고딕"/>
+              </w:rPr>
+              <w:t>상태</w:t>
+            </w:r>
+          </w:p>
+        </w:tc>
+      </w:tr>
+      <w:tr>
+        <w:tc>
+          <w:tcPr>
+            <w:tcW w:type="dxa" w:w="2166"/>
+          </w:tcPr>
+          <w:p>
+            <w:r/>
+            <w:r>
+              <w:rPr>
+                <w:rFonts w:ascii="맑은 고딕" w:hAnsi="맑은 고딕"/>
+                <w:b/>
+                <w:sz w:val="18"/>
+                <w:rFonts w:eastAsia="맑은 고딕"/>
+              </w:rPr>
+              <w:t>M1. 플랫폼 설계 완료 (5월)</w:t>
+            </w:r>
+          </w:p>
+        </w:tc>
+        <w:tc>
+          <w:tcPr>
+            <w:tcW w:type="dxa" w:w="2166"/>
+          </w:tcPr>
+          <w:p>
+            <w:r/>
+            <w:r>
+              <w:rPr>
+                <w:rFonts w:ascii="맑은 고딕" w:hAnsi="맑은 고딕"/>
+                <w:b w:val="0"/>
+                <w:sz w:val="18"/>
+                <w:rFonts w:eastAsia="맑은 고딕"/>
+              </w:rPr>
+              <w:t>요구사항 정의서</w:t>
+            </w:r>
+          </w:p>
+        </w:tc>
+        <w:tc>
+          <w:tcPr>
+            <w:tcW w:type="dxa" w:w="2166"/>
+          </w:tcPr>
+          <w:p>
+            <w:r/>
+            <w:r>
+              <w:rPr>
+                <w:rFonts w:ascii="맑은 고딕" w:hAnsi="맑은 고딕"/>
+                <w:b w:val="0"/>
+                <w:sz w:val="18"/>
+                <w:rFonts w:eastAsia="맑은 고딕"/>
+              </w:rPr>
+              <w:t>01_요구사항정의서.docx</w:t>
+            </w:r>
+          </w:p>
+        </w:tc>
+        <w:tc>
+          <w:tcPr>
+            <w:tcW w:type="dxa" w:w="2166"/>
+          </w:tcPr>
+          <w:p>
+            <w:r/>
+            <w:r>
+              <w:rPr>
+                <w:rFonts w:ascii="맑은 고딕" w:hAnsi="맑은 고딕"/>
+                <w:b w:val="0"/>
+                <w:sz w:val="18"/>
+                <w:rFonts w:eastAsia="맑은 고딕"/>
+              </w:rPr>
+              <w:t>충족</w:t>
+            </w:r>
+          </w:p>
+        </w:tc>
+      </w:tr>
+      <w:tr>
+        <w:tc>
+          <w:tcPr>
+            <w:tcW w:type="dxa" w:w="2166"/>
+          </w:tcPr>
+          <w:p>
+            <w:r/>
+            <w:r>
+              <w:rPr>
+                <w:rFonts w:ascii="맑은 고딕" w:hAnsi="맑은 고딕"/>
+                <w:b/>
+                <w:sz w:val="18"/>
+                <w:rFonts w:eastAsia="맑은 고딕"/>
+              </w:rPr>
+            </w:r>
+          </w:p>
+        </w:tc>
+        <w:tc>
+          <w:tcPr>
+            <w:tcW w:type="dxa" w:w="2166"/>
+          </w:tcPr>
+          <w:p>
+            <w:r/>
+            <w:r>
+              <w:rPr>
+                <w:rFonts w:ascii="맑은 고딕" w:hAnsi="맑은 고딕"/>
+                <w:b w:val="0"/>
+                <w:sz w:val="18"/>
+                <w:rFonts w:eastAsia="맑은 고딕"/>
+              </w:rPr>
+              <w:t>UI/UX 설계서</w:t>
+            </w:r>
+          </w:p>
+        </w:tc>
+        <w:tc>
+          <w:tcPr>
+            <w:tcW w:type="dxa" w:w="2166"/>
+          </w:tcPr>
+          <w:p>
+            <w:r/>
+            <w:r>
+              <w:rPr>
+                <w:rFonts w:ascii="맑은 고딕" w:hAnsi="맑은 고딕"/>
+                <w:b w:val="0"/>
+                <w:sz w:val="18"/>
+                <w:rFonts w:eastAsia="맑은 고딕"/>
+              </w:rPr>
+              <w:t>01-1_화면설계서.docx (화면 10종 lo-fi 설계)</w:t>
+            </w:r>
+          </w:p>
+        </w:tc>
+        <w:tc>
+          <w:tcPr>
+            <w:tcW w:type="dxa" w:w="2166"/>
+          </w:tcPr>
+          <w:p>
+            <w:r/>
+            <w:r>
+              <w:rPr>
+                <w:rFonts w:ascii="맑은 고딕" w:hAnsi="맑은 고딕"/>
+                <w:b w:val="0"/>
+                <w:sz w:val="18"/>
+                <w:rFonts w:eastAsia="맑은 고딕"/>
+              </w:rPr>
+              <w:t>충족</w:t>
+            </w:r>
+          </w:p>
+        </w:tc>
+      </w:tr>
+      <w:tr>
+        <w:tc>
+          <w:tcPr>
+            <w:tcW w:type="dxa" w:w="2166"/>
+          </w:tcPr>
+          <w:p>
+            <w:r/>
+            <w:r>
+              <w:rPr>
+                <w:rFonts w:ascii="맑은 고딕" w:hAnsi="맑은 고딕"/>
+                <w:b/>
+                <w:sz w:val="18"/>
+                <w:rFonts w:eastAsia="맑은 고딕"/>
+              </w:rPr>
+            </w:r>
+          </w:p>
+        </w:tc>
+        <w:tc>
+          <w:tcPr>
+            <w:tcW w:type="dxa" w:w="2166"/>
+          </w:tcPr>
+          <w:p>
+            <w:r/>
+            <w:r>
+              <w:rPr>
+                <w:rFonts w:ascii="맑은 고딕" w:hAnsi="맑은 고딕"/>
+                <w:b w:val="0"/>
+                <w:sz w:val="18"/>
+                <w:rFonts w:eastAsia="맑은 고딕"/>
+              </w:rPr>
+              <w:t>시스템 구성도</w:t>
+            </w:r>
+          </w:p>
+        </w:tc>
+        <w:tc>
+          <w:tcPr>
+            <w:tcW w:type="dxa" w:w="2166"/>
+          </w:tcPr>
+          <w:p>
+            <w:r/>
+            <w:r>
+              <w:rPr>
+                <w:rFonts w:ascii="맑은 고딕" w:hAnsi="맑은 고딕"/>
+                <w:b w:val="0"/>
+                <w:sz w:val="18"/>
+                <w:rFonts w:eastAsia="맑은 고딕"/>
+              </w:rPr>
+              <w:t>01-1_화면설계서.docx 제2장</w:t>
+            </w:r>
+          </w:p>
+        </w:tc>
+        <w:tc>
+          <w:tcPr>
+            <w:tcW w:type="dxa" w:w="2166"/>
+          </w:tcPr>
+          <w:p>
+            <w:r/>
+            <w:r>
+              <w:rPr>
+                <w:rFonts w:ascii="맑은 고딕" w:hAnsi="맑은 고딕"/>
+                <w:b w:val="0"/>
+                <w:sz w:val="18"/>
+                <w:rFonts w:eastAsia="맑은 고딕"/>
+              </w:rPr>
+              <w:t>충족</w:t>
+            </w:r>
+          </w:p>
+        </w:tc>
+      </w:tr>
+      <w:tr>
+        <w:tc>
+          <w:tcPr>
+            <w:tcW w:type="dxa" w:w="2166"/>
+          </w:tcPr>
+          <w:p>
+            <w:r/>
+            <w:r>
+              <w:rPr>
+                <w:rFonts w:ascii="맑은 고딕" w:hAnsi="맑은 고딕"/>
+                <w:b/>
+                <w:sz w:val="18"/>
+                <w:rFonts w:eastAsia="맑은 고딕"/>
+              </w:rPr>
+              <w:t>M2. 플랫폼 개발 완료 (6월)</w:t>
+            </w:r>
+          </w:p>
+        </w:tc>
+        <w:tc>
+          <w:tcPr>
+            <w:tcW w:type="dxa" w:w="2166"/>
+          </w:tcPr>
+          <w:p>
+            <w:r/>
+            <w:r>
+              <w:rPr>
+                <w:rFonts w:ascii="맑은 고딕" w:hAnsi="맑은 고딕"/>
+                <w:b w:val="0"/>
+                <w:sz w:val="18"/>
+                <w:rFonts w:eastAsia="맑은 고딕"/>
+              </w:rPr>
+              <w:t>HEALO 배포본</w:t>
+            </w:r>
+          </w:p>
+        </w:tc>
+        <w:tc>
+          <w:tcPr>
+            <w:tcW w:type="dxa" w:w="2166"/>
+          </w:tcPr>
+          <w:p>
+            <w:r/>
+            <w:r>
+              <w:rPr>
+                <w:rFonts w:ascii="맑은 고딕" w:hAnsi="맑은 고딕"/>
+                <w:b w:val="0"/>
+                <w:sz w:val="18"/>
+                <w:rFonts w:eastAsia="맑은 고딕"/>
+              </w:rPr>
+              <w:t>healwith.co.kr 실서비스 가동</w:t>
+            </w:r>
+          </w:p>
+        </w:tc>
+        <w:tc>
+          <w:tcPr>
+            <w:tcW w:type="dxa" w:w="2166"/>
+          </w:tcPr>
+          <w:p>
+            <w:r/>
+            <w:r>
+              <w:rPr>
+                <w:rFonts w:ascii="맑은 고딕" w:hAnsi="맑은 고딕"/>
+                <w:b w:val="0"/>
+                <w:sz w:val="18"/>
+                <w:rFonts w:eastAsia="맑은 고딕"/>
+              </w:rPr>
+              <w:t>충족</w:t>
+            </w:r>
+          </w:p>
+        </w:tc>
+      </w:tr>
+      <w:tr>
+        <w:tc>
+          <w:tcPr>
+            <w:tcW w:type="dxa" w:w="2166"/>
+          </w:tcPr>
+          <w:p>
+            <w:r/>
+            <w:r>
+              <w:rPr>
+                <w:rFonts w:ascii="맑은 고딕" w:hAnsi="맑은 고딕"/>
+                <w:b/>
+                <w:sz w:val="18"/>
+                <w:rFonts w:eastAsia="맑은 고딕"/>
+              </w:rPr>
+            </w:r>
+          </w:p>
+        </w:tc>
+        <w:tc>
+          <w:tcPr>
+            <w:tcW w:type="dxa" w:w="2166"/>
+          </w:tcPr>
+          <w:p>
+            <w:r/>
+            <w:r>
+              <w:rPr>
+                <w:rFonts w:ascii="맑은 고딕" w:hAnsi="맑은 고딕"/>
+                <w:b w:val="0"/>
+                <w:sz w:val="18"/>
+                <w:rFonts w:eastAsia="맑은 고딕"/>
+              </w:rPr>
+              <w:t>기능 테스트 결과서</w:t>
+            </w:r>
+          </w:p>
+        </w:tc>
+        <w:tc>
+          <w:tcPr>
+            <w:tcW w:type="dxa" w:w="2166"/>
+          </w:tcPr>
+          <w:p>
+            <w:r/>
+            <w:r>
+              <w:rPr>
+                <w:rFonts w:ascii="맑은 고딕" w:hAnsi="맑은 고딕"/>
+                <w:b w:val="0"/>
+                <w:sz w:val="18"/>
+                <w:rFonts w:eastAsia="맑은 고딕"/>
+              </w:rPr>
+              <w:t>08_테스트결과서.docx</w:t>
+            </w:r>
+          </w:p>
+        </w:tc>
+        <w:tc>
+          <w:tcPr>
+            <w:tcW w:type="dxa" w:w="2166"/>
+          </w:tcPr>
+          <w:p>
+            <w:r/>
+            <w:r>
+              <w:rPr>
+                <w:rFonts w:ascii="맑은 고딕" w:hAnsi="맑은 고딕"/>
+                <w:b w:val="0"/>
+                <w:sz w:val="18"/>
+                <w:rFonts w:eastAsia="맑은 고딕"/>
+              </w:rPr>
+              <w:t>충족</w:t>
+            </w:r>
+          </w:p>
+        </w:tc>
+      </w:tr>
+      <w:tr>
+        <w:tc>
+          <w:tcPr>
+            <w:tcW w:type="dxa" w:w="2166"/>
+          </w:tcPr>
+          <w:p>
+            <w:r/>
+            <w:r>
+              <w:rPr>
+                <w:rFonts w:ascii="맑은 고딕" w:hAnsi="맑은 고딕"/>
+                <w:b/>
+                <w:sz w:val="18"/>
+                <w:rFonts w:eastAsia="맑은 고딕"/>
+              </w:rPr>
+              <w:t>M4. 중간점검 (9월)</w:t>
+            </w:r>
+          </w:p>
+        </w:tc>
+        <w:tc>
+          <w:tcPr>
+            <w:tcW w:type="dxa" w:w="2166"/>
+          </w:tcPr>
+          <w:p>
+            <w:r/>
+            <w:r>
+              <w:rPr>
+                <w:rFonts w:ascii="맑은 고딕" w:hAnsi="맑은 고딕"/>
+                <w:b w:val="0"/>
+                <w:sz w:val="18"/>
+                <w:rFonts w:eastAsia="맑은 고딕"/>
+              </w:rPr>
+              <w:t>중간 실적 보고서</w:t>
+            </w:r>
+          </w:p>
+        </w:tc>
+        <w:tc>
+          <w:tcPr>
+            <w:tcW w:type="dxa" w:w="2166"/>
+          </w:tcPr>
+          <w:p>
+            <w:r/>
+            <w:r>
+              <w:rPr>
+                <w:rFonts w:ascii="맑은 고딕" w:hAnsi="맑은 고딕"/>
+                <w:b w:val="0"/>
+                <w:sz w:val="18"/>
+                <w:rFonts w:eastAsia="맑은 고딕"/>
+              </w:rPr>
+              <w:t>중간보고서 (KHIDI 지정 양식, 별도 관리)</w:t>
+            </w:r>
+          </w:p>
+        </w:tc>
+        <w:tc>
+          <w:tcPr>
+            <w:tcW w:type="dxa" w:w="2166"/>
+          </w:tcPr>
+          <w:p>
+            <w:r/>
+            <w:r>
+              <w:rPr>
+                <w:rFonts w:ascii="맑은 고딕" w:hAnsi="맑은 고딕"/>
+                <w:b w:val="0"/>
+                <w:sz w:val="18"/>
+                <w:rFonts w:eastAsia="맑은 고딕"/>
+              </w:rPr>
+              <w:t>진행</w:t>
+            </w:r>
+          </w:p>
+        </w:tc>
+      </w:tr>
+      <w:tr>
+        <w:tc>
+          <w:tcPr>
+            <w:tcW w:type="dxa" w:w="2166"/>
+          </w:tcPr>
+          <w:p>
+            <w:r/>
+            <w:r>
+              <w:rPr>
+                <w:rFonts w:ascii="맑은 고딕" w:hAnsi="맑은 고딕"/>
+                <w:b/>
+                <w:sz w:val="18"/>
+                <w:rFonts w:eastAsia="맑은 고딕"/>
+              </w:rPr>
+              <w:t>정성지표 증빙</w:t>
+            </w:r>
+          </w:p>
+        </w:tc>
+        <w:tc>
+          <w:tcPr>
+            <w:tcW w:type="dxa" w:w="2166"/>
+          </w:tcPr>
+          <w:p>
+            <w:r/>
+            <w:r>
+              <w:rPr>
+                <w:rFonts w:ascii="맑은 고딕" w:hAnsi="맑은 고딕"/>
+                <w:b w:val="0"/>
+                <w:sz w:val="18"/>
+                <w:rFonts w:eastAsia="맑은 고딕"/>
+              </w:rPr>
+              <w:t>플랫폼 시연 및 관련 산출물(정의서 · 설계서 · 테스트 결과 등)</w:t>
+            </w:r>
+          </w:p>
+        </w:tc>
+        <w:tc>
+          <w:tcPr>
+            <w:tcW w:type="dxa" w:w="2166"/>
+          </w:tcPr>
+          <w:p>
+            <w:r/>
+            <w:r>
+              <w:rPr>
+                <w:rFonts w:ascii="맑은 고딕" w:hAnsi="맑은 고딕"/>
+                <w:b w:val="0"/>
+                <w:sz w:val="18"/>
+                <w:rFonts w:eastAsia="맑은 고딕"/>
+              </w:rPr>
+              <w:t>위 문서 일체 + 02_기능명세서 · 11_6대ICT 대비표</w:t>
+            </w:r>
+          </w:p>
+        </w:tc>
+        <w:tc>
+          <w:tcPr>
+            <w:tcW w:type="dxa" w:w="2166"/>
+          </w:tcPr>
+          <w:p>
+            <w:r/>
+            <w:r>
+              <w:rPr>
+                <w:rFonts w:ascii="맑은 고딕" w:hAnsi="맑은 고딕"/>
+                <w:b w:val="0"/>
+                <w:sz w:val="18"/>
+                <w:rFonts w:eastAsia="맑은 고딕"/>
+              </w:rPr>
+              <w:t>충족</w:t>
             </w:r>
           </w:p>
         </w:tc>

</xml_diff>